<commit_message>
docs (docs/): actualiza la evidencia de tdd y clean code con cobertura, refactor y concurrencia
</commit_message>
<xml_diff>
--- a/docs/Evidencia-CleanCode-TDD-v3.docx
+++ b/docs/Evidencia-CleanCode-TDD-v3.docx
@@ -470,10 +470,7 @@
     </w:p>
     <w:p>
       <w:r>
-        <w:t>Este documento explica cómo y por qué el backend de FarmeORT se construyó con TDD y siguiendo Clean Code. El equipo aplicó una estrategia Outside-In: cada funcionalidad empezó por un test del controller y bajó al servicio, al dominio y al repositorio, con un commit por etapa del ciclo RED, GREEN y REFACTOR (516, 517 y 95 commits). En el cuerpo se muestra un ciclo completo con las capturas de sus commits; la evidencia de las demás funcionalidades está en los anexos. Los 1.046 tests pasan, todos los assemblie</w:t>
-      </w:r>
-      <w:r>
-        <w:t>s superan el 90 % de líneas y de ramas que exige el CI y, excluyendo lo que no es testeable, la cobertura es del 100 %. El foco está en el porqué: por qué Outside-In, por qué esos dobles de prueba, qué ganó el proyecto con TDD y por qué el código cumple Clean Code.</w:t>
+        <w:t>Este documento explica cómo y por qué el backend de FarmeORT se construyó con TDD y siguiendo Clean Code. El equipo aplicó una estrategia Outside-In: cada funcionalidad empezó por un test del controller y bajó al servicio, al dominio y al repositorio, con un commit por etapa del ciclo RED, GREEN y REFACTOR (516, 517 y 114 commits). En el cuerpo se muestra un ciclo completo con las capturas de sus commits; la evidencia de las demás funcionalidades está en los anexos. Los 1.046 tests pasan, todos los assemblies superan el 90 % de líneas y de ramas que exige el CI y, excluyendo lo que no es testeable, la cobertura es del 100 %. El foco está en el porqué: por qué Outside-In, por qué esos dobles de prueba, qué ganó el proyecto con TDD y por qué el código cumple Clean Code.</w:t>
       </w:r>
     </w:p>
     <w:p>
@@ -1400,7 +1397,7 @@
                 <w:noProof/>
                 <w:webHidden/>
               </w:rPr>
-              <w:t>15</w:t>
+              <w:t>16</w:t>
             </w:r>
             <w:r>
               <w:rPr>
@@ -1468,7 +1465,7 @@
                 <w:noProof/>
                 <w:webHidden/>
               </w:rPr>
-              <w:t>16</w:t>
+              <w:t>17</w:t>
             </w:r>
             <w:r>
               <w:rPr>
@@ -1536,7 +1533,7 @@
                 <w:noProof/>
                 <w:webHidden/>
               </w:rPr>
-              <w:t>16</w:t>
+              <w:t>17</w:t>
             </w:r>
             <w:r>
               <w:rPr>
@@ -1604,7 +1601,7 @@
                 <w:noProof/>
                 <w:webHidden/>
               </w:rPr>
-              <w:t>16</w:t>
+              <w:t>17</w:t>
             </w:r>
             <w:r>
               <w:rPr>
@@ -1672,7 +1669,7 @@
                 <w:noProof/>
                 <w:webHidden/>
               </w:rPr>
-              <w:t>16</w:t>
+              <w:t>18</w:t>
             </w:r>
             <w:r>
               <w:rPr>
@@ -1740,7 +1737,7 @@
                 <w:noProof/>
                 <w:webHidden/>
               </w:rPr>
-              <w:t>17</w:t>
+              <w:t>19</w:t>
             </w:r>
             <w:r>
               <w:rPr>
@@ -1808,7 +1805,7 @@
                 <w:noProof/>
                 <w:webHidden/>
               </w:rPr>
-              <w:t>19</w:t>
+              <w:t>20</w:t>
             </w:r>
             <w:r>
               <w:rPr>
@@ -1876,7 +1873,7 @@
                 <w:noProof/>
                 <w:webHidden/>
               </w:rPr>
-              <w:t>19</w:t>
+              <w:t>20</w:t>
             </w:r>
             <w:r>
               <w:rPr>
@@ -1944,7 +1941,7 @@
                 <w:noProof/>
                 <w:webHidden/>
               </w:rPr>
-              <w:t>19</w:t>
+              <w:t>20</w:t>
             </w:r>
             <w:r>
               <w:rPr>
@@ -2012,7 +2009,7 @@
                 <w:noProof/>
                 <w:webHidden/>
               </w:rPr>
-              <w:t>20</w:t>
+              <w:t>22</w:t>
             </w:r>
             <w:r>
               <w:rPr>
@@ -2080,7 +2077,7 @@
                 <w:noProof/>
                 <w:webHidden/>
               </w:rPr>
-              <w:t>22</w:t>
+              <w:t>23</w:t>
             </w:r>
             <w:r>
               <w:rPr>
@@ -2148,7 +2145,7 @@
                 <w:noProof/>
                 <w:webHidden/>
               </w:rPr>
-              <w:t>23</w:t>
+              <w:t>24</w:t>
             </w:r>
             <w:r>
               <w:rPr>
@@ -2216,7 +2213,7 @@
                 <w:noProof/>
                 <w:webHidden/>
               </w:rPr>
-              <w:t>23</w:t>
+              <w:t>24</w:t>
             </w:r>
             <w:r>
               <w:rPr>
@@ -2284,7 +2281,7 @@
                 <w:noProof/>
                 <w:webHidden/>
               </w:rPr>
-              <w:t>24</w:t>
+              <w:t>25</w:t>
             </w:r>
             <w:r>
               <w:rPr>
@@ -2352,7 +2349,7 @@
                 <w:noProof/>
                 <w:webHidden/>
               </w:rPr>
-              <w:t>26</w:t>
+              <w:t>27</w:t>
             </w:r>
             <w:r>
               <w:rPr>
@@ -2420,7 +2417,7 @@
                 <w:noProof/>
                 <w:webHidden/>
               </w:rPr>
-              <w:t>28</w:t>
+              <w:t>29</w:t>
             </w:r>
             <w:r>
               <w:rPr>
@@ -2488,7 +2485,7 @@
                 <w:noProof/>
                 <w:webHidden/>
               </w:rPr>
-              <w:t>28</w:t>
+              <w:t>29</w:t>
             </w:r>
             <w:r>
               <w:rPr>
@@ -2556,7 +2553,7 @@
                 <w:noProof/>
                 <w:webHidden/>
               </w:rPr>
-              <w:t>28</w:t>
+              <w:t>29</w:t>
             </w:r>
             <w:r>
               <w:rPr>
@@ -2624,7 +2621,7 @@
                 <w:noProof/>
                 <w:webHidden/>
               </w:rPr>
-              <w:t>28</w:t>
+              <w:t>29</w:t>
             </w:r>
             <w:r>
               <w:rPr>
@@ -2692,7 +2689,7 @@
                 <w:noProof/>
                 <w:webHidden/>
               </w:rPr>
-              <w:t>29</w:t>
+              <w:t>30</w:t>
             </w:r>
             <w:r>
               <w:rPr>
@@ -2760,7 +2757,7 @@
                 <w:noProof/>
                 <w:webHidden/>
               </w:rPr>
-              <w:t>29</w:t>
+              <w:t>30</w:t>
             </w:r>
             <w:r>
               <w:rPr>
@@ -2848,11 +2845,11 @@
             <w:color w:val="1155CC"/>
             <w:u w:val="single"/>
           </w:rPr>
-          <w:t>8fc243e</w:t>
+          <w:t>3ac010e</w:t>
         </w:r>
       </w:hyperlink>
       <w:r>
-        <w:t xml:space="preserve"> (último commit del PR #40, integrado a develop el 07/10/2026). Cada hash citado es un link al commit en GitHub, y las decisiones se identifican con su código en la bitácora del repositorio (por ejemplo, D-68).</w:t>
+        <w:t xml:space="preserve"> (merge del PR #44, el último integrado a develop el 07/10/2026). Cada hash citado es un link al commit en GitHub, y las decisiones se identifican con su código en la bitácora del repositorio (por ejemplo, D-68).</w:t>
       </w:r>
     </w:p>
     <w:p>
@@ -2878,10 +2875,7 @@
     </w:p>
     <w:p>
       <w:r>
-        <w:t>Cada funcionalidad se empezó por el borde de la API y se bajó capa por capa: Controller, IServicio, Servicio, Dominio, IRepositorio y Repositorio. El test del controller, con un mock del servicio, fija el código de estado, el header Location y que el servicio reciba al usuario del token; así aparece la firma que necesita IServicio. Los tests del servicio, con mocks de los repositorios, cubren una precondición o un efecto cada uno y definen qué métodos necesita cada IRepositorio. Las reglas que dependen solo</w:t>
-      </w:r>
-      <w:r>
-        <w:t xml:space="preserve"> de una entidad se prueban sobre ella sin dobles, y los repositorios se prueban con EF Core sobre SQLite en memoria cuando la consulta tiene lógica propia.</w:t>
+        <w:t>Cada funcionalidad se empezó por el borde de la API y se bajó capa por capa: Controller, IServicio, Servicio, Dominio, IRepositorio y Repositorio. El test del controller, con un mock del servicio, fija el código de estado, el header Location y que el servicio reciba al usuario del token; así aparece la firma que necesita IServicio. Los tests del servicio, con mocks de los repositorios, cubren una precondición o un efecto cada uno y definen qué métodos necesita cada IRepositorio. Las reglas que dependen solo de una entidad se prueban sobre ella sin dobles, y los repositorios se prueban con EF Core sobre SQLite en memoria cuando la consulta tiene lógica propia.</w:t>
       </w:r>
     </w:p>
     <w:p>
@@ -2907,10 +2901,7 @@
     </w:p>
     <w:p>
       <w:r>
-        <w:t>El obligatorio se define por endpoints y reglas de negocio, y el contrato de la API se acordó antes de escribir código. Empezar por el controller convierte ese contrato en un test desde el primer commit y hace que cada capa se construya para quien la usa: las interfaces IServicio e IRepositorio las define el test de la capa consumidora, no la que las implementa. Así no aparecen métodos de repositorio «por si acaso» ni entidades con datos que ningún caso de uso pide. Además encaja con la arquitectura (D-34):</w:t>
-      </w:r>
-      <w:r>
-        <w:t xml:space="preserve"> como la WebAPI solo conoce IServicios y los servicios solo conocen IRepositorios, cada capa se puede probar antes de que exista la de abajo. La Tabla 1 resume la comparación con la alternativa descartada.</w:t>
+        <w:t>El obligatorio se define por endpoints y reglas de negocio, y el contrato de la API se acordó antes de escribir código. Empezar por el controller convierte ese contrato en un test desde el primer commit y hace que cada capa se construya para quien la usa: las interfaces IServicio e IRepositorio las define el test de la capa consumidora, no la que las implementa. Así no aparecen métodos de repositorio «por si acaso» ni entidades con datos que ningún caso de uso pide. Además encaja con la arquitectura (D-34): como la WebAPI solo conoce IServicios y los servicios solo conocen IRepositorios, cada capa se puede probar antes de que exista la de abajo. La Tabla 1 resume la comparación con la alternativa descartada.</w:t>
       </w:r>
     </w:p>
     <w:p>
@@ -3606,10 +3597,7 @@
     </w:tbl>
     <w:p>
       <w:r>
-        <w:t>La contracara de Outside-In es que los tests de controller y de servicio usan dobles, y un test con mocks puede quedar atado a cómo está escrito el código en lugar de a qué hace. Se mitigó de tres formas: los mocks solo verifican los efectos que pide la regla (sección 1.3), las reglas que pertenecen a una entidad bajan al dominio y se prueban con objetos reales, y los repositorios se prueban contra una base real. El orden se ve en el historial: en la inscripción a un torneo (PR #16) el primer RED fue el del</w:t>
-      </w:r>
-      <w:r>
-        <w:t xml:space="preserve"> controller (</w:t>
+        <w:t>La contracara de Outside-In es que los tests de controller y de servicio usan dobles, y un test con mocks puede quedar atado a cómo está escrito el código en lugar de a qué hace. Se mitigó de tres formas: los mocks solo verifican los efectos que pide la regla (sección 1.3), las reglas que pertenecen a una entidad bajan al dominio y se prueban con objetos reales, y los repositorios se prueban contra una base real. El orden se ve en el historial: en la inscripción a un torneo (PR #16) el primer RED fue el del controller (</w:t>
       </w:r>
       <w:hyperlink r:id="rId11">
         <w:r>
@@ -3671,18 +3659,12 @@
     </w:p>
     <w:p>
       <w:r>
-        <w:t xml:space="preserve">Cada decisión sobre los dobles de prueba responde a un riesgo concreto. Moq se usa en modo estricto (MockBehavior.Strict) y con Setup sobre valores exactos: si el servicio llama a un repositorio que el test no previó, o con otro argumento, el test falla. Eso obliga a pensar qué necesita cada caso de uso y avisa cuando un cambio agrega una consulta inesperada. It.IsAny solo aparece para verificar que algo no ocurrió (Times.Never). Los repositorios que solo proveen datos son stubs, y los efectos se verifican </w:t>
-      </w:r>
-      <w:r>
-        <w:t>con Verify sobre el estado exacto del objeto guardado, para que el test pruebe la regla y no la implementación.</w:t>
-      </w:r>
-    </w:p>
-    <w:p>
-      <w:r>
-        <w:t>La fecha (TimeProvider, D-18) y el azar del empate de ELO (ISorteo, D-51) se inyectan porque un test que depende del reloj o de Random no es repetible. Los repositorios se prueban con la clase BaseDeDatosEnMemoria, que crea el esquema con el mismo FarmeORTContext sobre SQLite en memoria: mockear DbSet solo probaría que se llama a LINQ, mientras que una base real prueba lo que de verdad se rompe (filtros, orden con desempate, índices únicos y guardados atómicos). Como un test de controller no ejecuta los fil</w:t>
-      </w:r>
-      <w:r>
-        <w:t>tros, cada endpoint protegido tiene además un test que lee por reflexión sus atributos de autenticación y autorización (D-15). Por último, ningún test usa otro método del objeto bajo prueba para preparar o verificar, así una falla apunta a un solo método.</w:t>
+        <w:t>Cada decisión sobre los dobles de prueba responde a un riesgo concreto. Moq se usa en modo estricto (MockBehavior.Strict) y con Setup sobre valores exactos: si el servicio llama a un repositorio que el test no previó, o con otro argumento, el test falla. Eso obliga a pensar qué necesita cada caso de uso y avisa cuando un cambio agrega una consulta inesperada. It.IsAny solo aparece para verificar que algo no ocurrió (Times.Never). Los repositorios que solo proveen datos son stubs, y los efectos se verifican con Verify sobre el estado exacto del objeto guardado, para que el test pruebe la regla y no la implementación.</w:t>
+      </w:r>
+    </w:p>
+    <w:p>
+      <w:r>
+        <w:t>La fecha (TimeProvider, D-18) y el azar del empate de ELO (ISorteo, D-51) se inyectan porque un test que depende del reloj o de Random no es repetible. Los repositorios se prueban con la clase BaseDeDatosEnMemoria, que crea el esquema con el mismo FarmeORTContext sobre SQLite en memoria: mockear DbSet solo probaría que se llama a LINQ, mientras que una base real prueba lo que de verdad se rompe (filtros, orden con desempate, índices únicos y guardados atómicos). Como un test de controller no ejecuta los filtros, cada endpoint protegido tiene además un test que lee por reflexión sus atributos de autenticación y autorización (D-15). Por último, ningún test usa otro método del objeto bajo prueba para preparar o verificar, así una falla apunta a un solo método.</w:t>
       </w:r>
     </w:p>
     <w:p>
@@ -4546,18 +4528,12 @@
     </w:p>
     <w:p>
       <w:r>
-        <w:t xml:space="preserve">Cada etapa es un commit con el formato "tipo [ETAPA] (ruta): descripción". El commit test [RED] agrega un test que falla por la razón esperada (un assertion o la excepción que falta) y, si hace falta, solo la firma mínima del tipo o método nuevo, que lanza NotImplementedException; como el .editorconfig marca como error los parámetros sin usar, esa firma los descarta explícitamente hasta el GREEN (D-05). El commit feat [GREEN] o fix [GREEN] agrega el código mínimo para pasar, y refactor [REFACTOR] mejora la </w:t>
-      </w:r>
-      <w:r>
-        <w:t>estructura sin cambiar el comportamiento. En las funcionalidades prioritarias se hizo un test por commit RED, y las variantes de un mismo caso van con DataRow. El historial tiene 516 commits RED, 517 GREEN y 95 REFACTOR, sobre 1.329 commits sin contar los merges.</w:t>
-      </w:r>
-    </w:p>
-    <w:p>
-      <w:r>
-        <w:t>Separar las etapas en commits tiene tres ventajas. Cada línea de producción queda asociada al test que la pidió, y el historial lo demuestra. Los pasos son chicos: si algo falla, el error está en el último cambio. Y el REFACTOR, al ir solo, prueba que la mejora de estructura no cambió el comportamiento, porque los tests no se tocan y siguen en verde; si fuera junto con el GREEN no se podría distinguir una cosa de la otra. Cuando no había nada que mejorar no se inventó un refactor; por eso hay menos REFACTOR</w:t>
-      </w:r>
-      <w:r>
-        <w:t xml:space="preserve"> que GREEN.</w:t>
+        <w:t>Cada etapa es un commit con el formato "tipo [ETAPA] (ruta): descripción". El commit test [RED] agrega un test que falla por la razón esperada (un assertion o la excepción que falta) y, si hace falta, solo la firma mínima del tipo o método nuevo, que lanza NotImplementedException; como el .editorconfig marca como error los parámetros sin usar, esa firma los descarta explícitamente hasta el GREEN (D-05). El commit feat [GREEN] o fix [GREEN] agrega el código mínimo para pasar, y refactor [REFACTOR] mejora la estructura sin cambiar el comportamiento. En las funcionalidades prioritarias se hizo un test por commit RED, y las variantes de un mismo caso van con DataRow. El historial tiene 516 commits RED, 517 GREEN y 114 REFACTOR, sobre 1.354 commits sin contar los merges.</w:t>
+      </w:r>
+    </w:p>
+    <w:p>
+      <w:r>
+        <w:t>Separar las etapas en commits tiene tres ventajas. Cada línea de producción queda asociada al test que la pidió, y el historial lo demuestra. Los pasos son chicos: si algo falla, el error está en el último cambio. Y el REFACTOR, al ir solo, prueba que la mejora de estructura no cambió el comportamiento, porque los tests no se tocan y siguen en verde; si fuera junto con el GREEN no se podría distinguir una cosa de la otra. Cuando no había nada que mejorar no se inventó un refactor; por eso hay menos REFACTOR que GREEN.</w:t>
       </w:r>
     </w:p>
     <w:p>
@@ -4583,10 +4559,7 @@
     </w:p>
     <w:p>
       <w:r>
-        <w:t>El ciclo elegido es de la inscripción a un torneo, una de las funcionalidades prioritarias. Cuando se falla una batalla, la inscripción del perdedor pasa a Eliminada. Inscripcion.Eliminar() ya existía y Cancelar() ya rechazaba una inscripción que no estuviera Aceptada, pero Eliminar() todavía permitía eliminar una inscripción cancelada. Los tres commits se hicieron en poco más de un minuto (de 19:48 a 19:49 del 01/10/2026), y las capturas muestran que son consecutivos: el padre de cada uno es el anterior (5</w:t>
-      </w:r>
-      <w:r>
-        <w:t>1beed8 → d0838d3 → 3adb163 → 24c7ea5), y cada uno cambia un solo archivo.</w:t>
+        <w:t>El ciclo elegido es de la inscripción a un torneo, una de las funcionalidades prioritarias. Cuando se falla una batalla, la inscripción del perdedor pasa a Eliminada. Inscripcion.Eliminar() ya existía y Cancelar() ya rechazaba una inscripción que no estuviera Aceptada, pero Eliminar() todavía permitía eliminar una inscripción cancelada. Los tres commits se hicieron en poco más de un minuto (de 19:48 a 19:49 del 01/10/2026), y las capturas muestran que son consecutivos: el padre de cada uno es el anterior (51beed8 → d0838d3 → 3adb163 → 24c7ea5), y cada uno cambia un solo archivo.</w:t>
       </w:r>
     </w:p>
     <w:p>
@@ -4774,12 +4747,6 @@
                 <w:szCs w:val="20"/>
               </w:rPr>
               <w:br/>
-            </w:r>
-            <w:r>
-              <w:rPr>
-                <w:sz w:val="20"/>
-                <w:szCs w:val="20"/>
-              </w:rPr>
               <w:t xml:space="preserve">    Assert.AreEqual(EstadoInscripcion.Cancelada, inscripcion.Estado);</w:t>
             </w:r>
             <w:r>
@@ -4834,10 +4801,7 @@
         <w:jc w:val="left"/>
       </w:pPr>
       <w:r>
-        <w:t>El commit agrega únicamente el test Eliminar_InscripcionCancelada_LanzaInscripcionNoActivaSinCambiarla y no toca código de producción. Falla por la razón esperada: Eliminar() no lanza ninguna excepción, así que falla el Assert.ThrowsExactly, no la compilación ni la configuración. El nombre dice qué método se prueba, en qué escenario y qué se espera, y el segundo assert fija una parte de la regla que es fácil olvidar: si se rechaza, el estado no cambia. La captura muestra que el commit solo suma 10 líneas en</w:t>
-      </w:r>
-      <w:r>
-        <w:t xml:space="preserve"> un archivo, el de tests.</w:t>
+        <w:t>El commit agrega únicamente el test Eliminar_InscripcionCancelada_LanzaInscripcionNoActivaSinCambiarla y no toca código de producción. Falla por la razón esperada: Eliminar() no lanza ninguna excepción, así que falla el Assert.ThrowsExactly, no la compilación ni la configuración. El nombre dice qué método se prueba, en qué escenario y qué se espera, y el segundo assert fija una parte de la regla que es fácil olvidar: si se rechaza, el estado no cambia. La captura muestra que el commit solo suma 10 líneas en un archivo, el de tests.</w:t>
       </w:r>
     </w:p>
     <w:p>
@@ -5303,12 +5267,6 @@
                 <w:szCs w:val="20"/>
               </w:rPr>
               <w:br/>
-            </w:r>
-            <w:r>
-              <w:rPr>
-                <w:sz w:val="20"/>
-                <w:szCs w:val="20"/>
-              </w:rPr>
               <w:t xml:space="preserve">    ValidarAceptada();</w:t>
             </w:r>
             <w:r>
@@ -5472,13 +5430,7 @@
     </w:p>
     <w:p>
       <w:r>
-        <w:t xml:space="preserve">La letra del obligatorio [2] marca con (*) cinco funcionalidades cuya evolución debe verse en los commits. Cada una se desarrolló en su propia rama y entró a develop por un Pull Request con merge commit, sin squash, para conservar los commits de cada etapa. </w:t>
-      </w:r>
-      <w:r>
-        <w:t>La Tabla 3 cuenta esos commits</w:t>
-      </w:r>
-      <w:r>
-        <w:t xml:space="preserve"> dentro de la rama de cada funcionalidad. Después de su PR siguieron con ciclos propios: concurrencia (PR #28 y #31), auditoría de legibilidad (PR #30 y #32) y rutas de la revisión docente (PR #33).</w:t>
+        <w:t>La letra del obligatorio [2] marca con (*) cinco funcionalidades cuya evolución debe verse en los commits. Cada una se desarrolló en su propia rama y entró a develop por un Pull Request con merge commit, sin squash, para conservar los commits de cada etapa. La Tabla 3 cuenta esos commits dentro de la rama de cada funcionalidad. Después de su PR siguieron con ciclos propios: concurrencia (PR #28 y #31), auditoría de legibilidad (PR #30 y #32) rutas de la revisión docente (PR #33) y el refactor de Clean Code (PR #43, sección 5.2).</w:t>
       </w:r>
     </w:p>
     <w:p>
@@ -5495,14 +5447,7 @@
           <w:sz w:val="20"/>
           <w:szCs w:val="20"/>
         </w:rPr>
-        <w:t>Tabla 3</w:t>
-      </w:r>
-      <w:r>
-        <w:rPr>
-          <w:sz w:val="20"/>
-          <w:szCs w:val="20"/>
-        </w:rPr>
-        <w:t>. Commits por etapa en la rama de cada funcionalidad prioritaria</w:t>
+        <w:t>Tabla 3. Commits por etapa en la rama de cada funcionalidad prioritaria</w:t>
       </w:r>
     </w:p>
     <w:tbl>
@@ -7304,7 +7249,7 @@
     </w:p>
     <w:p>
       <w:r>
-        <w:t>Todo el código entró a develop por Pull Request (40 PR integrados al 07/10/2026), con la plantilla obligatoria del curso, merge commit (squash y rebase están deshabilitados en el repositorio) y los tres checks obligatorios en verde: Build, Test y Analysis. Los workflows son los de la configuración obligatoria del curso y corren en los self-hosted runners de los integrantes. La Tabla 4 muestra cuántos PR abrió y aprobó cada integrante.</w:t>
+        <w:t>Todo el código entró a develop por Pull Request (44 PR integrados al 07/10/2026), con la plantilla obligatoria del curso, merge commit (squash y rebase están deshabilitados en el repositorio) y los tres checks obligatorios en verde: Build, Test y Analysis. Los workflows son los de la configuración obligatoria del curso y corren en los self-hosted runners de los integrantes. La Tabla 4 muestra cuántos PR abrió y aprobó cada integrante.</w:t>
       </w:r>
     </w:p>
     <w:p>
@@ -7531,7 +7476,7 @@
                 <w:sz w:val="20"/>
                 <w:szCs w:val="20"/>
               </w:rPr>
-              <w:t>21</w:t>
+              <w:t>25</w:t>
             </w:r>
           </w:p>
         </w:tc>
@@ -7779,7 +7724,7 @@
                 <w:sz w:val="20"/>
                 <w:szCs w:val="20"/>
               </w:rPr>
-              <w:t>20</w:t>
+              <w:t>24</w:t>
             </w:r>
           </w:p>
         </w:tc>
@@ -7818,12 +7763,12 @@
     </w:p>
     <w:p>
       <w:r>
-        <w:t>El borrador de este documento lo redactó Claude Code (modelo Claude Opus 5.5) a partir de datos del repositorio: el historial de commits, la ejecución de las pruebas, las mediciones de coverlet, los Pull Requests, la bitácora de decisiones y el código. Se le indicó no inventar código ni decisiones, y las cifras se pueden verificar con el comando de la Ilustración 4 y los commits enlazados. El equipo revisó el contenido antes de entregarlo.</w:t>
-      </w:r>
-    </w:p>
-    <w:p>
-      <w:r>
-        <w:t>La IA también propuso la reorganización de esta versión (sección de beneficios, ciclo completo con capturas y anexos); las capturas de los commits las tomó el equipo en GitHub. Las Ilustraciones 5 y 9 son la salida real de coverlet sobre 8fc243e, pasada a imagen por la IA en lugar de una captura de pantalla.</w:t>
+        <w:t>El borrador de este documento lo redactó Claude Code (modelo Claude Opus 5.5) a partir de datos del repositorio: el historial de commits, la ejecución de las pruebas, las mediciones de coverlet, los Pull Requests, la bitácora de decisiones y el código. Se le indicó no inventar código ni decisiones, y las cifras se pueden verificar en el comentario que el check Test deja en cada Pull Request y en los commits enlazados. El equipo revisó el contenido antes de entregarlo.</w:t>
+      </w:r>
+    </w:p>
+    <w:p>
+      <w:r>
+        <w:t>La IA también propuso la reorganización de esta versión (sección de beneficios, ciclo completo con capturas y anexos); las capturas de los commits las tomó el equipo en GitHub. Las Ilustraciones 4 y 8 son la salida real de coverlet sobre 8fc243e, pasada a imagen por la IA en lugar de una captura de pantalla. La verificación con Fine Code Coverage la hizo el equipo en Visual Studio. La actualización final (datos sobre 3ac010e, refactor del PR #43, concurrencia y Postman) también la redactó Claude Code a partir del repositorio y la bitácora, y la revisó el equipo.</w:t>
       </w:r>
     </w:p>
     <w:p>
@@ -7835,18 +7780,12 @@
         <w:t>Reflexión del equipo.</w:t>
       </w:r>
       <w:r>
-        <w:t xml:space="preserve"> La IA nos sirvió sobre todo para revisar y medir: contrastó el código con la letra, el foro y la configuración del curso, y reprodujo las mediciones de este documento. Aceptamos la estructura que propuso para esta versión (un ciclo completo en el cuerpo, el resto de la evidencia en anexos y una sección de beneficios) porque respondía a las observaciones que recibimos sobre la anterior. No aceptamos todo lo que propuso: en la auditoría de legibilidad (D-68) fijamos nosotros el alcance y rechazamos o posterg</w:t>
-      </w:r>
-      <w:r>
-        <w:t>amos algunas simplificaciones, y en D-33 revertimos una excepción a internal sealed después de revisar lo que pedían los docentes. Al actualizar este documento aparecieron dos problemas: la primera medición se hizo en Release, que cuenta menos líneas que el Debug de la medición original, y había que aclarar que la exclusión de SorteoAleatorio.cs no está en el .runsettings del CI. Los dos se corrigieron antes de entregar, y las capturas de los commits las tomamos nosotros.</w:t>
-      </w:r>
-    </w:p>
-    <w:p>
-      <w:r>
-        <w:t>Sobre TDD y Clean Code, lo que más aprendimos es que escribir el test primero cambia el diseño: las interfaces de los repositorios salieron de lo que pedía cada servicio, y el reloj y el azar se inyectaron porque sin eso los tests no eran repetibles. También aprendimos que una cobertura alta no alcanza: la auditoría encontró tests que pasaban sin verificar la regla, como asserts sobre la lista vacía de un mock, y los reforzamos. El costo fue real, porque avanzar test por test es más lento al principio y los</w:t>
-      </w:r>
-      <w:r>
-        <w:t xml:space="preserve"> mocks estrictos obligan a tocar tests cuando cambia una interfaz, pero nos permitió hacer refactors grandes como el de D-68 sin miedo a romper algo. Revisamos todo lo que generó la IA y podemos defenderlo; la decisión final de cada cambio fue nuestra.</w:t>
+        <w:t xml:space="preserve"> La IA nos sirvió sobre todo para revisar y medir: contrastó el código con la letra, el foro y la configuración del curso, y reprodujo las mediciones de este documento. Aceptamos la estructura que propuso para esta versión (un ciclo completo en el cuerpo, el resto de la evidencia en anexos y una sección de beneficios) porque respondía a las observaciones que recibimos sobre la anterior. No aceptamos todo lo que propuso: en la auditoría de legibilidad (D-68) fijamos nosotros el alcance y rechazamos o postergamos algunas simplificaciones, y en D-33 revertimos una excepción a internal sealed después de revisar lo que pedían los docentes. Al actualizar este documento aparecieron dos problemas: la primera medición se hizo en Release, que cuenta menos líneas que el Debug de la medición original, y había que aclarar que la exclusión de SorteoAleatorio.cs no está en el .runsettings del CI. Los dos se corrigieron antes de entregar, y las capturas de los commits las tomamos nosotros.</w:t>
+      </w:r>
+    </w:p>
+    <w:p>
+      <w:r>
+        <w:t>Sobre TDD y Clean Code, lo que más aprendimos es que escribir el test primero cambia el diseño: las interfaces de los repositorios salieron de lo que pedía cada servicio, y el reloj y el azar se inyectaron porque sin eso los tests no eran repetibles. También aprendimos que una cobertura alta no alcanza: la auditoría encontró tests que pasaban sin verificar la regla, como asserts sobre la lista vacía de un mock, y los reforzamos. El costo fue real, porque avanzar test por test es más lento al principio y los mocks estrictos obligan a tocar tests cuando cambia una interfaz, pero nos permitió hacer refactors grandes como el de D-68 sin miedo a romper algo. Revisamos todo lo que generó la IA y podemos defenderlo; la decisión final de cada cambio fue nuestra.</w:t>
       </w:r>
     </w:p>
     <w:p>
@@ -7885,7 +7824,7 @@
         <w:t>Refactorizar con una red de seguridad.</w:t>
       </w:r>
       <w:r>
-        <w:t xml:space="preserve"> Antes de la entrega el equipo revisó todo el código para que un tercero lo entienda con el menor esfuerzo (D-68, PR #30 y #32) y reemplazó construcciones poco conocidas por if explícitos en todos los assemblies. Sin tests, un cambio así es riesgoso; con la suite completa en verde después de cada paso se hizo sin cambiar el comportamiento, y los dos errores que aparecieron se corrigieron con su propio ciclo RED y GREEN. Lo mismo vale para los 95 commits REFACTOR.</w:t>
+        <w:t xml:space="preserve"> Antes de la entrega el equipo revisó todo el código para que un tercero lo entienda con el menor esfuerzo (D-68, PR #30 y #32) y reemplazó construcciones poco conocidas por if explícitos en todos los assemblies. Sin tests, un cambio así es riesgoso; con la suite completa en verde después de cada paso se hizo sin cambiar el comportamiento, y los dos errores que aparecieron se corrigieron con su propio ciclo RED y GREEN. Lo mismo vale para los 114 commits REFACTOR, entre ellos los 19 del refactor de Clean Code del PR #43, que no modificaron ningún test (sección 5.2).</w:t>
       </w:r>
     </w:p>
     <w:p>
@@ -8045,17 +7984,19 @@
             <w:color w:val="1155CC"/>
             <w:u w:val="single"/>
           </w:rPr>
-          <w:t>8fc243e</w:t>
+          <w:t>3ac010e</w:t>
         </w:r>
       </w:hyperlink>
       <w:r>
-        <w:t xml:space="preserve"> </w:t>
-      </w:r>
-      <w:r>
-        <w:t>pasan los 1.046 tests</w:t>
-      </w:r>
-      <w:r>
-        <w:t xml:space="preserve"> (218 de Dominio, 329 de Servicios, 185 de Repositorios, 301 de WebAPI y 13 de Fábrica), sin fallos ni tests omitidos.</w:t>
+        <w:t xml:space="preserve"> pasan los 1.046 tests (218 de Dominio, 329 de Servicios, 185 de Repositorios, 301 de WebAPI y 13 de Fábrica), sin fallos ni tests omitidos.</w:t>
+      </w:r>
+    </w:p>
+    <w:p>
+      <w:r>
+        <w:t>Además de la suite, la API se probó de punta a punta con la colección de Postman de la carpeta Datos: 412 requests organizados por recurso y endpoint, todos con un test del código de estado y 234 que además verifican el errorCode del error. La última ejecución completa con el Collection Runner, contra la API local sobre SQL Server, dio 924 tests aprobados y ningún fallo (D-78). Las dos pruebas se complementan: los tests unitarios aíslan cada capa con dobles y señalan la regla exacta que se rompe, y la colec</w:t>
+      </w:r>
+      <w:r>
+        <w:t>ción comprueba que las capas integradas, los filtros y la base real responden lo que dice la especificación de la API.</w:t>
       </w:r>
     </w:p>
     <w:p>
@@ -8081,132 +8022,18 @@
     </w:p>
     <w:p>
       <w:r>
-        <w:t>La cobertura se midió localmente con coverlet [3] (coverlet.console 10.1.0), sin usar los resultados de GitHub Actions. Cada proyecto de prueba se ejecuta a través de coverlet, que instrumenta los assemblies FarmeORT.* sin los de prueba, y los cinco resultados se combinan con --merge-with, de modo que una línea cuenta como cubierta si la ejecuta cualquier proyecto (ver Ilustración 4).</w:t>
-      </w:r>
-    </w:p>
-    <w:p>
-      <w:pPr>
-        <w:spacing w:before="55" w:line="276" w:lineRule="auto"/>
-        <w:ind w:left="-1365" w:right="-1320"/>
-        <w:jc w:val="center"/>
-        <w:rPr>
-          <w:b/>
-          <w:bCs/>
-          <w:i/>
-          <w:iCs/>
-          <w:sz w:val="48"/>
-          <w:szCs w:val="48"/>
-        </w:rPr>
-      </w:pPr>
-    </w:p>
-    <w:tbl>
-      <w:tblPr>
-        <w:tblStyle w:val="af"/>
-        <w:tblW w:w="9054" w:type="dxa"/>
-        <w:tblBorders>
-          <w:top w:val="single" w:sz="5" w:space="0" w:color="000000"/>
-          <w:left w:val="single" w:sz="5" w:space="0" w:color="000000"/>
-          <w:bottom w:val="single" w:sz="5" w:space="0" w:color="000000"/>
-          <w:right w:val="single" w:sz="5" w:space="0" w:color="000000"/>
-          <w:insideH w:val="single" w:sz="5" w:space="0" w:color="000000"/>
-          <w:insideV w:val="single" w:sz="5" w:space="0" w:color="000000"/>
-        </w:tblBorders>
-        <w:tblLayout w:type="fixed"/>
-        <w:tblLook w:val="0600" w:firstRow="0" w:lastRow="0" w:firstColumn="0" w:lastColumn="0" w:noHBand="1" w:noVBand="1"/>
-      </w:tblPr>
-      <w:tblGrid>
-        <w:gridCol w:w="9054"/>
-      </w:tblGrid>
-      <w:tr>
-        <w:trPr>
-          <w:trHeight w:val="1040"/>
-        </w:trPr>
-        <w:tc>
-          <w:tcPr>
-            <w:tcW w:w="9054" w:type="dxa"/>
-            <w:tcBorders>
-              <w:top w:val="single" w:sz="5" w:space="0" w:color="000000"/>
-              <w:left w:val="single" w:sz="5" w:space="0" w:color="000000"/>
-              <w:bottom w:val="single" w:sz="5" w:space="0" w:color="000000"/>
-              <w:right w:val="single" w:sz="5" w:space="0" w:color="000000"/>
-            </w:tcBorders>
-            <w:shd w:val="clear" w:color="auto" w:fill="F3F3F3"/>
-            <w:tcMar>
-              <w:top w:w="100" w:type="dxa"/>
-              <w:left w:w="100" w:type="dxa"/>
-              <w:bottom w:w="100" w:type="dxa"/>
-              <w:right w:w="100" w:type="dxa"/>
-            </w:tcMar>
-          </w:tcPr>
-          <w:p>
-            <w:pPr>
-              <w:jc w:val="left"/>
-              <w:rPr>
-                <w:sz w:val="20"/>
-                <w:szCs w:val="20"/>
-              </w:rPr>
-            </w:pPr>
-            <w:r>
-              <w:rPr>
-                <w:sz w:val="20"/>
-                <w:szCs w:val="20"/>
-              </w:rPr>
-              <w:t>coverlet FarmeORT.&lt;Proyecto&gt;.Tests.dll --target dotnet</w:t>
-            </w:r>
-            <w:r>
-              <w:rPr>
-                <w:sz w:val="20"/>
-                <w:szCs w:val="20"/>
-              </w:rPr>
-              <w:br/>
-              <w:t xml:space="preserve">    --targetargs "test FarmeORT.&lt;Proyecto&gt;.Tests.dll --no-build"</w:t>
-            </w:r>
-            <w:r>
-              <w:rPr>
-                <w:sz w:val="20"/>
-                <w:szCs w:val="20"/>
-              </w:rPr>
-              <w:br/>
-            </w:r>
-            <w:r>
-              <w:rPr>
-                <w:sz w:val="20"/>
-                <w:szCs w:val="20"/>
-              </w:rPr>
-              <w:t xml:space="preserve">    --include "[FarmeORT.*]*" --exclude "[FarmeORT.*.Tests]*"</w:t>
-            </w:r>
-            <w:r>
-              <w:rPr>
-                <w:sz w:val="20"/>
-                <w:szCs w:val="20"/>
-              </w:rPr>
-              <w:br/>
-              <w:t xml:space="preserve">    --merge-with coverage.json</w:t>
-            </w:r>
-          </w:p>
-        </w:tc>
-      </w:tr>
-    </w:tbl>
-    <w:p>
-      <w:pPr>
-        <w:spacing w:before="80" w:line="276" w:lineRule="auto"/>
-        <w:jc w:val="center"/>
-        <w:rPr>
-          <w:sz w:val="20"/>
-          <w:szCs w:val="20"/>
-        </w:rPr>
-      </w:pPr>
-      <w:r>
-        <w:rPr>
-          <w:sz w:val="20"/>
-          <w:szCs w:val="20"/>
-        </w:rPr>
-        <w:t>Ilustración 4. Comando de coverlet para cada proyecto de prueba</w:t>
-      </w:r>
-    </w:p>
-    <w:p>
-      <w:r>
-        <w:t>Se midió dos veces: sin exclusiones y excluyendo lo que no es testeable (Program.cs, Migrations/*.cs y SorteoAleatorio.cs, con --exclude-by-file). Las exclusiones son parámetros de la medición: el código no tiene ningún atributo ExcludeFromCodeCoverage.</w:t>
+        <w:t>La cobertura que vale para el proyecto es la que mide el check Test de GitHub Actions en cada Pull Request. El check corre todos los tests con coverlet.collector [3] y el .runsettings obligatorio del curso [5], y falla si algún assembly queda por debajo de 90 % de líneas o de ramas. Ese .runsettings excluye por archivo las migraciones (*Migrations/*.cs), Program.cs y los contextos de EF Core (*DbContext.cs y *Context.cs), y por atributo el código generado (GeneratedCodeAttribute). Se excluye lo que no tiene</w:t>
+      </w:r>
+      <w:r>
+        <w:t xml:space="preserve"> lógica propia que probar: las migraciones las genera dotnet ef a partir del modelo, Program.cs solo arranca la aplicación (lo que configura está en métodos con tests) y el contexto solo declara el mapeo. Las exclusiones son parámetros de la medición: el código no tiene ningún atributo ExcludeFromCodeCoverage.</w:t>
+      </w:r>
+    </w:p>
+    <w:p>
+      <w:r>
+        <w:t xml:space="preserve">Además, el equipo verificó la cobertura en Visual Studio con la extensión Fine Code Coverage, que no usa el .runsettings y mide todo el código, incluidos los proyectos de prueba. Sin exclusiones, Repositorios da 15,5 % de líneas (750 de 4.815) y 30,2 % de ramas (132 de 436), y WebAPI da 97,5 % de líneas (440 de 451) y 95,4 % de ramas (42 de 44). Todo lo que falta está en los archivos que excluye el .runsettings: las 4.065 líneas y 304 ramas sin cubrir de Repositorios son de las migraciones, y las 11 líneas </w:t>
+      </w:r>
+      <w:r>
+        <w:t>y 2 ramas de WebAPI son de Program.cs. Al descontar esos archivos, los números coinciden con los del check: Repositorios y WebAPI quedan en 100 % de líneas y de ramas, y Servicios da 100 % de líneas y 99,6 % de ramas (269 de 270) en las dos herramientas.</w:t>
       </w:r>
     </w:p>
     <w:p>
@@ -8232,7 +8059,10 @@
     </w:p>
     <w:p>
       <w:r>
-        <w:t>Con esas tres exclusiones, coverlet informa 100 % de líneas (3.038 de 3.038), de ramas (542 de 542) y de métodos en los nueve assemblies (ver Ilustración 5).</w:t>
+        <w:t>El check Test del PR #44, el último integrado, informa 100 % de líneas en los nueve assemblies y 99,95 % de ramas en total. El único desvío es una rama de SorteoAleatorio.cs, el envoltorio de Random que en cada corrida ejecuta una sola de sus dos ramas, por lo que Servicios da 99,58 % de ramas, por encima del 90 % que exige el check. Como control adicional se midió en local con coverlet.console 10.1.0 sobre 8fc243e (antes del refactor del PR #43, que no cambió ningún test), excluyendo también ese archivo: d</w:t>
+      </w:r>
+      <w:r>
+        <w:t>a 100 % de líneas (3.038 de 3.038), de ramas (542 de 542) y de métodos en los nueve assemblies (ver Ilustración 4).</w:t>
       </w:r>
     </w:p>
     <w:p>
@@ -8294,7 +8124,7 @@
           <w:sz w:val="20"/>
           <w:szCs w:val="20"/>
         </w:rPr>
-        <w:t>Ilustración 5. Salida de coverlet excluyendo Program.cs, Migrations/*.cs y SorteoAleatorio.cs</w:t>
+        <w:t>Ilustración 4. Salida de coverlet en local excluyendo Program.cs, Migrations/*.cs y SorteoAleatorio.cs</w:t>
       </w:r>
     </w:p>
     <w:p>
@@ -8328,7 +8158,7 @@
     </w:p>
     <w:p>
       <w:r>
-        <w:t>Sin exclusiones el total es 42,72 % de líneas, casi todo por las migraciones que genera dotnet ef (el 57 % de las líneas medidas); el detalle está en el Anexo B. El check Test del CI mide con el .runsettings obligatorio, que excluye las migraciones, Program.cs y el contexto, pero no SorteoAleatorio.cs: con esa configuración el único desvío es una rama de ese envoltorio de Random, y Servicios da 99,6 % de ramas, por encima del 90 % que exige el check.</w:t>
+        <w:t>Sin exclusiones, coverlet da 42,72 % de líneas en total, casi todo por las migraciones que genera dotnet ef (el 57 % de las líneas medidas), lo mismo que muestra Fine Code Coverage; el detalle está en el Anexo B.</w:t>
       </w:r>
     </w:p>
     <w:p>
@@ -8414,6 +8244,68 @@
     </w:p>
     <w:p>
       <w:pPr>
+        <w:jc w:val="left"/>
+      </w:pPr>
+      <w:r>
+        <w:t xml:space="preserve">La atomicidad y la concurrencia también tienen tests. La letra pide que fallar una batalla y cancelar un torneo tengan efectos atómicos, y una auditoría del 02/10/2026 reprodujo carreras entre pedidos simultáneos: dos inscripciones Aceptadas del mismo jugador, más Aceptadas que el cupo y una ronda generada dos veces (D-70). Cada caso empezó con un RED que reproduce la carrera: el test abre un segundo contexto sobre la misma base SQLite, intercala sus lecturas y guardados con los del repositorio bajo prueba </w:t>
+      </w:r>
+      <w:r>
+        <w:t xml:space="preserve">y verifica que solo uno se confirma. Por ejemplo, Agregar_DosPedidosDelMismoJugadorLeenAntesDeGuardar_SoloUnoQuedaAceptado (RED </w:t>
+      </w:r>
+      <w:hyperlink r:id="rId40">
+        <w:r>
+          <w:rPr>
+            <w:color w:val="1155CC"/>
+            <w:u w:val="single"/>
+          </w:rPr>
+          <w:t>fec00de</w:t>
+        </w:r>
+      </w:hyperlink>
+      <w:r>
+        <w:t xml:space="preserve">, GREEN </w:t>
+      </w:r>
+      <w:hyperlink r:id="rId41">
+        <w:r>
+          <w:rPr>
+            <w:color w:val="1155CC"/>
+            <w:u w:val="single"/>
+          </w:rPr>
+          <w:t>d45fdc1</w:t>
+        </w:r>
+      </w:hyperlink>
+      <w:r>
+        <w:t xml:space="preserve">) y, en el fallo de una batalla, Guardar_EloConcurrente_RechazaFalloSinGuardarEfectosParciales (RED </w:t>
+      </w:r>
+      <w:hyperlink r:id="rId42">
+        <w:r>
+          <w:rPr>
+            <w:color w:val="1155CC"/>
+            <w:u w:val="single"/>
+          </w:rPr>
+          <w:t>9ac387e</w:t>
+        </w:r>
+      </w:hyperlink>
+      <w:r>
+        <w:t xml:space="preserve">, GREEN </w:t>
+      </w:r>
+      <w:hyperlink r:id="rId43">
+        <w:r>
+          <w:rPr>
+            <w:color w:val="1155CC"/>
+            <w:u w:val="single"/>
+          </w:rPr>
+          <w:t>4afd02b</w:t>
+        </w:r>
+      </w:hyperlink>
+      <w:r>
+        <w:t>), que cambia el ELO de un jugador desde otro contexto y comprueba que el fallo se rechaza sin dejar nada a medias: la batalla sigue Pendiente, ningún ELO cambia y la inscripción del perdedor sigue Aceptada. La corrección usa la concurrencia optimista de EF Core (una versión del torneo, D-70 y D-71) y responde 409 para que el cliente vuelva a consultar. Un test que dependiera de hilos y tiempos fallaría solo a veces; intercalar los pasos a mano hace que la carrera ocurra siempre igual, así que el test sigue</w:t>
+      </w:r>
+      <w:r>
+        <w:t xml:space="preserve"> siendo repetible.</w:t>
+      </w:r>
+    </w:p>
+    <w:p>
+      <w:pPr>
         <w:pStyle w:val="Heading1"/>
         <w:keepLines w:val="0"/>
         <w:pageBreakBefore/>
@@ -8462,10 +8354,7 @@
     </w:p>
     <w:p>
       <w:r>
-        <w:t>Parte del estilo no depende de la disciplina de cada integrante: el .editorconfig y StyleCop.Analyzers de la configuración obligatoria del curso [5] marcan como error, entre otras cosas, no usar primary constructors para inyectar dependencias, namespaces que no son file-scoped, bloques sin llaves, usings sin usar y parámetros o miembros privados sin usar. El build falla si se rompe una de esas reglas, y el check Analysis corre dotnet format --verify-no-changes en cada PR. Ninguna regla se desactivó con #pra</w:t>
-      </w:r>
-      <w:r>
-        <w:t>gma, SuppressMessage ni cambios de severidad.</w:t>
+        <w:t>Parte del estilo no depende de la disciplina de cada integrante: el .editorconfig y StyleCop.Analyzers de la configuración obligatoria del curso [5] marcan como error, entre otras cosas, no usar primary constructors para inyectar dependencias, namespaces que no son file-scoped, bloques sin llaves, usings sin usar y parámetros o miembros privados sin usar. El build falla si se rompe una de esas reglas, y el check Analysis corre dotnet format --verify-no-changes en cada PR. Ninguna regla se desactivó con #pragma, SuppressMessage ni cambios de severidad.</w:t>
       </w:r>
     </w:p>
     <w:p>
@@ -8496,7 +8385,7 @@
     </w:p>
     <w:p>
       <w:r>
-        <w:t>La Tabla 5 resume, por tema del libro, qué se ve en el código y qué ventaja trae. El Anexo C desarrolla cada punto con más ejemplos.</w:t>
+        <w:t>La Tabla 5 resume, por tema del libro, qué se ve en el código y qué ventaja trae, y a continuación se describe la revisión de Clean Code previa a la entrega. El Anexo C desarrolla cada punto con más ejemplos.</w:t>
       </w:r>
     </w:p>
     <w:p>
@@ -9685,7 +9574,7 @@
                 <w:sz w:val="20"/>
                 <w:szCs w:val="20"/>
               </w:rPr>
-              <w:t>95 REFACTOR que quitan duplicación; ningún patrón que la letra no pida (D-51).</w:t>
+              <w:t>114 REFACTOR que quitan duplicación y acortan métodos largos (PR #43); ningún patrón que la letra no pida (D-51).</w:t>
             </w:r>
           </w:p>
         </w:tc>
@@ -9725,6 +9614,55 @@
         </w:tc>
       </w:tr>
     </w:tbl>
+    <w:p>
+      <w:pPr>
+        <w:spacing w:before="240"/>
+      </w:pPr>
+      <w:r>
+        <w:t>Antes de la entrega se hizo además una revisión de Clean Code de todo src/ con tres criterios que se pueden medir: métodos de más de 20 líneas, números mágicos y métodos con más de 3 parámetros (PR #43). Se resolvió con 19 commits REFACTOR, uno por cambio, y ningún test se modificó: los 1.046 siguieron en verde después de cada commit, que es la prueba de que el comportamiento no cambió. Algunos resultados: OnModelCreating pasó de 65 a 11 líneas con una configuración por entidad (</w:t>
+      </w:r>
+      <w:hyperlink r:id="rId44">
+        <w:r>
+          <w:rPr>
+            <w:color w:val="1155CC"/>
+            <w:u w:val="single"/>
+          </w:rPr>
+          <w:t>830b91b</w:t>
+        </w:r>
+      </w:hyperlink>
+      <w:r>
+        <w:t>), ServicioFallos.Fallar pasó de 38 a 14 al extraer sus pasos con nombre (</w:t>
+      </w:r>
+      <w:hyperlink r:id="rId45">
+        <w:r>
+          <w:rPr>
+            <w:color w:val="1155CC"/>
+            <w:u w:val="single"/>
+          </w:rPr>
+          <w:t>bb0bd0a</w:t>
+        </w:r>
+      </w:hyperlink>
+      <w:r>
+        <w:t>), y el límite de paginado por defecto, que estaba repetido en cinco DTOs, quedó en una sola constante (</w:t>
+      </w:r>
+      <w:hyperlink r:id="rId46">
+        <w:r>
+          <w:rPr>
+            <w:color w:val="1155CC"/>
+            <w:u w:val="single"/>
+          </w:rPr>
+          <w:t>3d454d0</w:t>
+        </w:r>
+      </w:hyperlink>
+      <w:r>
+        <w:t>).</w:t>
+      </w:r>
+    </w:p>
+    <w:p>
+      <w:r>
+        <w:t>Lo que no se cambió también quedó registrado en el PR: Torneo.Modificar todavía recibe 9 parámetros, y los constructores de Torneo y Usuario reciben 8. Agruparlos en objetos parámetro cambia firmas públicas del dominio, muchos tests y el diagrama de clases, así que el equipo no lo hizo a último momento y lo dejó como una mejora pendiente conocida.</w:t>
+      </w:r>
+    </w:p>
     <w:p>
       <w:pPr>
         <w:pStyle w:val="Heading2"/>
@@ -9750,7 +9688,7 @@
       <w:r>
         <w:t xml:space="preserve">El cálculo de ELO después del REFACTOR </w:t>
       </w:r>
-      <w:hyperlink r:id="rId40">
+      <w:hyperlink r:id="rId47">
         <w:r>
           <w:rPr>
             <w:color w:val="1155CC"/>
@@ -9760,10 +9698,19 @@
         </w:r>
       </w:hyperlink>
       <w:r>
-        <w:t xml:space="preserve"> (Ilustración 6) reúne varios de esos puntos. El método público se lee como la regla de la letra: calcula el nuevo ELO del ganador y del perdedor, los dos con los valores previos. La fórmula está una sola vez, en CalcularNuevoElo, en lugar de repetirse para cada jugador; los números de la letra son constantes con nombre (K, EloMinimo) y no valores sueltos, y el piso de 100 es un if explícito. La clase implementa ICalculadorElo, así que otra fórmula se agrega con una implementación nueva sin tocar el código </w:t>
-      </w:r>
-      <w:r>
-        <w:t>que la usa.</w:t>
+        <w:t xml:space="preserve"> y </w:t>
+      </w:r>
+      <w:hyperlink r:id="rId48">
+        <w:r>
+          <w:rPr>
+            <w:color w:val="1155CC"/>
+            <w:u w:val="single"/>
+          </w:rPr>
+          <w:t>75a6c6f</w:t>
+        </w:r>
+      </w:hyperlink>
+      <w:r>
+        <w:t xml:space="preserve"> (Ilustración 5) reúne varios de esos puntos. El método público se lee como la regla de la letra: calcula el nuevo ELO del ganador y del perdedor, los dos con los valores previos. La fórmula está una sola vez, en CalcularNuevoElo, en lugar de repetirse para cada jugador; los números de la letra son constantes con nombre (K, EloMinimo, BaseLogistica y FactorDeEscala) y no valores sueltos, con un comentario que explica de dónde salen la base y la escala, y el piso de 100 es un if explícito. La clase implementa ICalculadorElo, así que otra fórmula se agrega con una implementación nueva sin tocar el código que la usa.</w:t>
       </w:r>
     </w:p>
     <w:tbl>
@@ -9819,6 +9766,76 @@
                 <w:sz w:val="20"/>
                 <w:szCs w:val="20"/>
               </w:rPr>
+              <w:t>private const int K = 32;</w:t>
+            </w:r>
+            <w:r>
+              <w:rPr>
+                <w:sz w:val="20"/>
+                <w:szCs w:val="20"/>
+              </w:rPr>
+              <w:br/>
+              <w:t>private const int Victoria = 1;</w:t>
+            </w:r>
+            <w:r>
+              <w:rPr>
+                <w:sz w:val="20"/>
+                <w:szCs w:val="20"/>
+              </w:rPr>
+              <w:br/>
+              <w:t>private const int Derrota = 0;</w:t>
+            </w:r>
+            <w:r>
+              <w:rPr>
+                <w:sz w:val="20"/>
+                <w:szCs w:val="20"/>
+              </w:rPr>
+              <w:br/>
+              <w:t>private const int EloMinimo = 100;</w:t>
+            </w:r>
+            <w:r>
+              <w:rPr>
+                <w:sz w:val="20"/>
+                <w:szCs w:val="20"/>
+              </w:rPr>
+              <w:br/>
+            </w:r>
+            <w:r>
+              <w:rPr>
+                <w:sz w:val="20"/>
+                <w:szCs w:val="20"/>
+              </w:rPr>
+              <w:br/>
+              <w:t>// Con 400 puntos de diferencia, el de mayor ELO tiene 10 veces más chances de ganar (letra 1.10).</w:t>
+            </w:r>
+            <w:r>
+              <w:rPr>
+                <w:sz w:val="20"/>
+                <w:szCs w:val="20"/>
+              </w:rPr>
+              <w:br/>
+              <w:t>private const double BaseLogistica = 10;</w:t>
+            </w:r>
+            <w:r>
+              <w:rPr>
+                <w:sz w:val="20"/>
+                <w:szCs w:val="20"/>
+              </w:rPr>
+              <w:br/>
+              <w:t>private const double FactorDeEscala = 400.0;</w:t>
+            </w:r>
+            <w:r>
+              <w:rPr>
+                <w:sz w:val="20"/>
+                <w:szCs w:val="20"/>
+              </w:rPr>
+              <w:br/>
+            </w:r>
+            <w:r>
+              <w:rPr>
+                <w:sz w:val="20"/>
+                <w:szCs w:val="20"/>
+              </w:rPr>
+              <w:br/>
               <w:t>public ResultadoElo Calcular(int eloGanador, int eloPerdedor)</w:t>
             </w:r>
             <w:r>
@@ -9890,7 +9907,7 @@
                 <w:szCs w:val="20"/>
               </w:rPr>
               <w:br/>
-              <w:t xml:space="preserve">    var puntajeEsperado = 1 / (1 + Math.Pow(10, (eloRival - elo) / 400.0));</w:t>
+              <w:t xml:space="preserve">    var puntajeEsperado = 1 / (1 + Math.Pow(BaseLogistica, (eloRival - elo) / FactorDeEscala));</w:t>
             </w:r>
             <w:r>
               <w:rPr>
@@ -9898,12 +9915,6 @@
                 <w:szCs w:val="20"/>
               </w:rPr>
               <w:br/>
-            </w:r>
-            <w:r>
-              <w:rPr>
-                <w:sz w:val="20"/>
-                <w:szCs w:val="20"/>
-              </w:rPr>
               <w:t xml:space="preserve">    var nuevoElo = (int)Math.Round(elo + (K * (resultado - puntajeEsperado)));</w:t>
             </w:r>
             <w:r>
@@ -9979,7 +9990,7 @@
           <w:sz w:val="20"/>
           <w:szCs w:val="20"/>
         </w:rPr>
-        <w:t>Ilustración 6. Cálculo de ELO en CalculadorEloBase</w:t>
+        <w:t>Ilustración 5. Cálculo de ELO en CalculadorEloBase</w:t>
       </w:r>
     </w:p>
     <w:p>
@@ -10225,7 +10236,7 @@
                 <w:u w:val="single"/>
               </w:rPr>
             </w:pPr>
-            <w:hyperlink r:id="rId41">
+            <w:hyperlink r:id="rId49">
               <w:r>
                 <w:rPr>
                   <w:color w:val="1155CC"/>
@@ -10304,7 +10315,7 @@
                 <w:u w:val="single"/>
               </w:rPr>
             </w:pPr>
-            <w:hyperlink r:id="rId42">
+            <w:hyperlink r:id="rId50">
               <w:r>
                 <w:rPr>
                   <w:color w:val="1155CC"/>
@@ -10383,7 +10394,7 @@
                 <w:u w:val="single"/>
               </w:rPr>
             </w:pPr>
-            <w:hyperlink r:id="rId43">
+            <w:hyperlink r:id="rId51">
               <w:r>
                 <w:rPr>
                   <w:color w:val="1155CC"/>
@@ -10462,7 +10473,7 @@
                 <w:u w:val="single"/>
               </w:rPr>
             </w:pPr>
-            <w:hyperlink r:id="rId44">
+            <w:hyperlink r:id="rId52">
               <w:r>
                 <w:rPr>
                   <w:color w:val="1155CC"/>
@@ -10541,7 +10552,7 @@
                 <w:u w:val="single"/>
               </w:rPr>
             </w:pPr>
-            <w:hyperlink r:id="rId45">
+            <w:hyperlink r:id="rId53">
               <w:r>
                 <w:rPr>
                   <w:color w:val="1155CC"/>
@@ -10620,7 +10631,7 @@
                 <w:u w:val="single"/>
               </w:rPr>
             </w:pPr>
-            <w:hyperlink r:id="rId46">
+            <w:hyperlink r:id="rId54">
               <w:r>
                 <w:rPr>
                   <w:color w:val="1155CC"/>
@@ -10673,12 +10684,12 @@
       <w:r>
         <w:t>Un ciclo completo es el del cupo de inscripciones aceptadas. El commit RED</w:t>
       </w:r>
-      <w:hyperlink r:id="rId47">
+      <w:hyperlink r:id="rId55">
         <w:r>
           <w:t xml:space="preserve"> </w:t>
         </w:r>
       </w:hyperlink>
-      <w:hyperlink r:id="rId48">
+      <w:hyperlink r:id="rId56">
         <w:r>
           <w:rPr>
             <w:color w:val="1155CC"/>
@@ -10688,7 +10699,7 @@
         </w:r>
       </w:hyperlink>
       <w:r>
-        <w:t xml:space="preserve"> agrega el test de la Ilustración 7, la excepción TorneoCompletoException y solo la firma de ContarAceptadas en IRepositorioInscripciones; el test falla porque el servicio todavía no consulta el cupo.</w:t>
+        <w:t xml:space="preserve"> agrega el test de la Ilustración 6, la excepción TorneoCompletoException y solo la firma de ContarAceptadas en IRepositorioInscripciones; el test falla porque el servicio todavía no consulta el cupo.</w:t>
       </w:r>
     </w:p>
     <w:tbl>
@@ -10767,12 +10778,6 @@
                 <w:szCs w:val="20"/>
               </w:rPr>
               <w:br/>
-            </w:r>
-            <w:r>
-              <w:rPr>
-                <w:sz w:val="20"/>
-                <w:szCs w:val="20"/>
-              </w:rPr>
               <w:t xml:space="preserve">    ConfigurarInscripcionValida();</w:t>
             </w:r>
             <w:r>
@@ -10832,19 +10837,19 @@
           <w:sz w:val="20"/>
           <w:szCs w:val="20"/>
         </w:rPr>
-        <w:t>Ilustración 7. Test del commit RED 2904e6b</w:t>
+        <w:t>Ilustración 6. Test del commit RED 2904e6b</w:t>
       </w:r>
     </w:p>
     <w:p>
       <w:r>
         <w:t>El commit GREEN</w:t>
       </w:r>
-      <w:hyperlink r:id="rId49">
+      <w:hyperlink r:id="rId57">
         <w:r>
           <w:t xml:space="preserve"> </w:t>
         </w:r>
       </w:hyperlink>
-      <w:hyperlink r:id="rId50">
+      <w:hyperlink r:id="rId58">
         <w:r>
           <w:rPr>
             <w:color w:val="1155CC"/>
@@ -10854,7 +10859,7 @@
         </w:r>
       </w:hyperlink>
       <w:r>
-        <w:t xml:space="preserve"> agrega solo la validación de la Ilustración 8 y, como el mock es estricto, configura ContarAceptadas en el arrange común de los tests que ya existían.</w:t>
+        <w:t xml:space="preserve"> agrega solo la validación de la Ilustración 7 y, como el mock es estricto, configura ContarAceptadas en el arrange común de los tests que ya existían.</w:t>
       </w:r>
     </w:p>
     <w:tbl>
@@ -10953,7 +10958,7 @@
           <w:sz w:val="20"/>
           <w:szCs w:val="20"/>
         </w:rPr>
-        <w:t>Ilustración 8. Validación agregada en el commit GREEN 2f46811</w:t>
+        <w:t>Ilustración 7. Validación agregada en el commit GREEN 2f46811</w:t>
       </w:r>
     </w:p>
     <w:p>
@@ -10984,13 +10989,7 @@
     </w:p>
     <w:p>
       <w:r>
-        <w:t xml:space="preserve">La </w:t>
-      </w:r>
-      <w:r>
-        <w:t>Tabla 7</w:t>
-      </w:r>
-      <w:r>
-        <w:t xml:space="preserve"> resume, para las demás funcionalidades, ciclos RED y GREEN representativos y el REFACTOR más relevante.</w:t>
+        <w:t>La Tabla 7 resume, para las demás funcionalidades, ciclos RED y GREEN representativos y el REFACTOR más relevante.</w:t>
       </w:r>
     </w:p>
     <w:p>
@@ -11007,14 +11006,7 @@
           <w:sz w:val="20"/>
           <w:szCs w:val="20"/>
         </w:rPr>
-        <w:t>Tabla 7</w:t>
-      </w:r>
-      <w:r>
-        <w:rPr>
-          <w:sz w:val="20"/>
-          <w:szCs w:val="20"/>
-        </w:rPr>
-        <w:t>. Ciclos y refactors representativos de las demás funcionalidades prioritarias</w:t>
+        <w:t>Tabla 7. Ciclos y refactors representativos de las demás funcionalidades prioritarias</w:t>
       </w:r>
     </w:p>
     <w:tbl>
@@ -11224,7 +11216,7 @@
                 <w:szCs w:val="20"/>
               </w:rPr>
             </w:pPr>
-            <w:hyperlink r:id="rId51">
+            <w:hyperlink r:id="rId59">
               <w:r>
                 <w:rPr>
                   <w:color w:val="1155CC"/>
@@ -11239,233 +11231,6 @@
               <w:sdtPr>
                 <w:tag w:val="goog_rdk_1"/>
                 <w:id w:val="-1771268524"/>
-              </w:sdtPr>
-              <w:sdtEndPr/>
-              <w:sdtContent>
-                <w:r>
-                  <w:rPr>
-                    <w:rFonts w:ascii="Cardo" w:eastAsia="Cardo" w:hAnsi="Cardo" w:cs="Cardo"/>
-                    <w:sz w:val="20"/>
-                    <w:szCs w:val="20"/>
-                  </w:rPr>
-                  <w:t xml:space="preserve"> →</w:t>
-                </w:r>
-              </w:sdtContent>
-            </w:sdt>
-            <w:hyperlink r:id="rId52">
-              <w:r>
-                <w:rPr>
-                  <w:sz w:val="20"/>
-                  <w:szCs w:val="20"/>
-                </w:rPr>
-                <w:t xml:space="preserve"> </w:t>
-              </w:r>
-            </w:hyperlink>
-            <w:hyperlink r:id="rId53">
-              <w:r>
-                <w:rPr>
-                  <w:color w:val="1155CC"/>
-                  <w:sz w:val="20"/>
-                  <w:szCs w:val="20"/>
-                  <w:u w:val="single"/>
-                </w:rPr>
-                <w:t>275f56e</w:t>
-              </w:r>
-            </w:hyperlink>
-            <w:r>
-              <w:rPr>
-                <w:sz w:val="20"/>
-                <w:szCs w:val="20"/>
-              </w:rPr>
-              <w:t>: crea la skill con 201 y Location.</w:t>
-            </w:r>
-            <w:hyperlink r:id="rId54">
-              <w:r>
-                <w:rPr>
-                  <w:sz w:val="20"/>
-                  <w:szCs w:val="20"/>
-                </w:rPr>
-                <w:t xml:space="preserve"> </w:t>
-              </w:r>
-            </w:hyperlink>
-            <w:hyperlink r:id="rId55">
-              <w:r>
-                <w:rPr>
-                  <w:color w:val="1155CC"/>
-                  <w:sz w:val="20"/>
-                  <w:szCs w:val="20"/>
-                  <w:u w:val="single"/>
-                </w:rPr>
-                <w:t>ef706bf</w:t>
-              </w:r>
-            </w:hyperlink>
-            <w:sdt>
-              <w:sdtPr>
-                <w:tag w:val="goog_rdk_2"/>
-                <w:id w:val="-2117846937"/>
-              </w:sdtPr>
-              <w:sdtEndPr/>
-              <w:sdtContent>
-                <w:r>
-                  <w:rPr>
-                    <w:rFonts w:ascii="Cardo" w:eastAsia="Cardo" w:hAnsi="Cardo" w:cs="Cardo"/>
-                    <w:sz w:val="20"/>
-                    <w:szCs w:val="20"/>
-                  </w:rPr>
-                  <w:t xml:space="preserve"> →</w:t>
-                </w:r>
-              </w:sdtContent>
-            </w:sdt>
-            <w:hyperlink r:id="rId56">
-              <w:r>
-                <w:rPr>
-                  <w:sz w:val="20"/>
-                  <w:szCs w:val="20"/>
-                </w:rPr>
-                <w:t xml:space="preserve"> </w:t>
-              </w:r>
-            </w:hyperlink>
-            <w:hyperlink r:id="rId57">
-              <w:r>
-                <w:rPr>
-                  <w:color w:val="1155CC"/>
-                  <w:sz w:val="20"/>
-                  <w:szCs w:val="20"/>
-                  <w:u w:val="single"/>
-                </w:rPr>
-                <w:t>20ec93b</w:t>
-              </w:r>
-            </w:hyperlink>
-            <w:r>
-              <w:rPr>
-                <w:sz w:val="20"/>
-                <w:szCs w:val="20"/>
-              </w:rPr>
-              <w:t>: solo el administrador mantiene el catálogo.</w:t>
-            </w:r>
-          </w:p>
-        </w:tc>
-        <w:tc>
-          <w:tcPr>
-            <w:tcW w:w="3242" w:type="dxa"/>
-            <w:tcBorders>
-              <w:top w:val="single" w:sz="5" w:space="0" w:color="000000"/>
-              <w:left w:val="single" w:sz="5" w:space="0" w:color="000000"/>
-              <w:bottom w:val="single" w:sz="5" w:space="0" w:color="000000"/>
-              <w:right w:val="single" w:sz="5" w:space="0" w:color="000000"/>
-            </w:tcBorders>
-            <w:tcMar>
-              <w:top w:w="100" w:type="dxa"/>
-              <w:left w:w="100" w:type="dxa"/>
-              <w:bottom w:w="100" w:type="dxa"/>
-              <w:right w:w="100" w:type="dxa"/>
-            </w:tcMar>
-          </w:tcPr>
-          <w:p>
-            <w:pPr>
-              <w:spacing w:before="40" w:after="40" w:line="276" w:lineRule="auto"/>
-              <w:rPr>
-                <w:sz w:val="20"/>
-                <w:szCs w:val="20"/>
-              </w:rPr>
-            </w:pPr>
-            <w:hyperlink r:id="rId58">
-              <w:r>
-                <w:rPr>
-                  <w:color w:val="1155CC"/>
-                  <w:sz w:val="20"/>
-                  <w:szCs w:val="20"/>
-                  <w:u w:val="single"/>
-                </w:rPr>
-                <w:t>ec26d51</w:t>
-              </w:r>
-            </w:hyperlink>
-            <w:r>
-              <w:rPr>
-                <w:sz w:val="20"/>
-                <w:szCs w:val="20"/>
-              </w:rPr>
-              <w:t>: el constructor reutiliza Modificar, así alta y modificación validan igual.</w:t>
-            </w:r>
-          </w:p>
-        </w:tc>
-      </w:tr>
-      <w:tr>
-        <w:trPr>
-          <w:trHeight w:val="1010"/>
-        </w:trPr>
-        <w:tc>
-          <w:tcPr>
-            <w:tcW w:w="1609" w:type="dxa"/>
-            <w:tcBorders>
-              <w:top w:val="single" w:sz="5" w:space="0" w:color="000000"/>
-              <w:left w:val="single" w:sz="5" w:space="0" w:color="000000"/>
-              <w:bottom w:val="single" w:sz="5" w:space="0" w:color="000000"/>
-              <w:right w:val="single" w:sz="5" w:space="0" w:color="000000"/>
-            </w:tcBorders>
-            <w:tcMar>
-              <w:top w:w="100" w:type="dxa"/>
-              <w:left w:w="100" w:type="dxa"/>
-              <w:bottom w:w="100" w:type="dxa"/>
-              <w:right w:w="100" w:type="dxa"/>
-            </w:tcMar>
-          </w:tcPr>
-          <w:p>
-            <w:pPr>
-              <w:spacing w:before="40" w:after="40" w:line="276" w:lineRule="auto"/>
-              <w:rPr>
-                <w:sz w:val="20"/>
-                <w:szCs w:val="20"/>
-              </w:rPr>
-            </w:pPr>
-            <w:r>
-              <w:rPr>
-                <w:sz w:val="20"/>
-                <w:szCs w:val="20"/>
-              </w:rPr>
-              <w:t>Lanzar una skill</w:t>
-            </w:r>
-          </w:p>
-        </w:tc>
-        <w:tc>
-          <w:tcPr>
-            <w:tcW w:w="4202" w:type="dxa"/>
-            <w:tcBorders>
-              <w:top w:val="single" w:sz="5" w:space="0" w:color="000000"/>
-              <w:left w:val="single" w:sz="5" w:space="0" w:color="000000"/>
-              <w:bottom w:val="single" w:sz="5" w:space="0" w:color="000000"/>
-              <w:right w:val="single" w:sz="5" w:space="0" w:color="000000"/>
-            </w:tcBorders>
-            <w:tcMar>
-              <w:top w:w="100" w:type="dxa"/>
-              <w:left w:w="100" w:type="dxa"/>
-              <w:bottom w:w="100" w:type="dxa"/>
-              <w:right w:w="100" w:type="dxa"/>
-            </w:tcMar>
-          </w:tcPr>
-          <w:p>
-            <w:pPr>
-              <w:spacing w:before="40" w:after="40" w:line="276" w:lineRule="auto"/>
-              <w:rPr>
-                <w:sz w:val="20"/>
-                <w:szCs w:val="20"/>
-              </w:rPr>
-            </w:pPr>
-            <w:hyperlink r:id="rId59">
-              <w:r>
-                <w:rPr>
-                  <w:color w:val="1155CC"/>
-                  <w:sz w:val="20"/>
-                  <w:szCs w:val="20"/>
-                  <w:u w:val="single"/>
-                </w:rPr>
-                <w:t>bd497d3</w:t>
-              </w:r>
-            </w:hyperlink>
-            <w:sdt>
-              <w:sdtPr>
-                <w:tag w:val="goog_rdk_3"/>
-                <w:id w:val="-1025122390"/>
               </w:sdtPr>
               <w:sdtEndPr/>
               <w:sdtContent>
@@ -11496,7 +11261,7 @@
                   <w:szCs w:val="20"/>
                   <w:u w:val="single"/>
                 </w:rPr>
-                <w:t>5ed4057</w:t>
+                <w:t>275f56e</w:t>
               </w:r>
             </w:hyperlink>
             <w:r>
@@ -11504,7 +11269,7 @@
                 <w:sz w:val="20"/>
                 <w:szCs w:val="20"/>
               </w:rPr>
-              <w:t>: empieza el jugador de mayor ELO.</w:t>
+              <w:t>: crea la skill con 201 y Location.</w:t>
             </w:r>
             <w:hyperlink r:id="rId62">
               <w:r>
@@ -11523,13 +11288,13 @@
                   <w:szCs w:val="20"/>
                   <w:u w:val="single"/>
                 </w:rPr>
-                <w:t>93da606</w:t>
+                <w:t>ef706bf</w:t>
               </w:r>
             </w:hyperlink>
             <w:sdt>
               <w:sdtPr>
-                <w:tag w:val="goog_rdk_4"/>
-                <w:id w:val="-1692427899"/>
+                <w:tag w:val="goog_rdk_2"/>
+                <w:id w:val="-2117846937"/>
               </w:sdtPr>
               <w:sdtEndPr/>
               <w:sdtContent>
@@ -11560,7 +11325,7 @@
                   <w:szCs w:val="20"/>
                   <w:u w:val="single"/>
                 </w:rPr>
-                <w:t>14849c3</w:t>
+                <w:t>20ec93b</w:t>
               </w:r>
             </w:hyperlink>
             <w:r>
@@ -11568,7 +11333,7 @@
                 <w:sz w:val="20"/>
                 <w:szCs w:val="20"/>
               </w:rPr>
-              <w:t>: registra el lanzamiento y alterna el turno.</w:t>
+              <w:t>: solo el administrador mantiene el catálogo.</w:t>
             </w:r>
           </w:p>
         </w:tc>
@@ -11604,7 +11369,7 @@
                   <w:szCs w:val="20"/>
                   <w:u w:val="single"/>
                 </w:rPr>
-                <w:t>b452842</w:t>
+                <w:t>ec26d51</w:t>
               </w:r>
             </w:hyperlink>
             <w:r>
@@ -11612,7 +11377,7 @@
                 <w:sz w:val="20"/>
                 <w:szCs w:val="20"/>
               </w:rPr>
-              <w:t>: separa la validación del registro del lanzamiento.</w:t>
+              <w:t>: el constructor reutiliza Modificar, así alta y modificación validan igual.</w:t>
             </w:r>
           </w:p>
         </w:tc>
@@ -11650,7 +11415,7 @@
                 <w:sz w:val="20"/>
                 <w:szCs w:val="20"/>
               </w:rPr>
-              <w:t>Fallar una batalla y ELO</w:t>
+              <w:t>Lanzar una skill</w:t>
             </w:r>
           </w:p>
         </w:tc>
@@ -11686,13 +11451,13 @@
                   <w:szCs w:val="20"/>
                   <w:u w:val="single"/>
                 </w:rPr>
-                <w:t>01ea0b6</w:t>
+                <w:t>bd497d3</w:t>
               </w:r>
             </w:hyperlink>
             <w:sdt>
               <w:sdtPr>
-                <w:tag w:val="goog_rdk_5"/>
-                <w:id w:val="-1412520672"/>
+                <w:tag w:val="goog_rdk_3"/>
+                <w:id w:val="-1025122390"/>
               </w:sdtPr>
               <w:sdtEndPr/>
               <w:sdtContent>
@@ -11723,7 +11488,7 @@
                   <w:szCs w:val="20"/>
                   <w:u w:val="single"/>
                 </w:rPr>
-                <w:t>f7e4668</w:t>
+                <w:t>5ed4057</w:t>
               </w:r>
             </w:hyperlink>
             <w:r>
@@ -11731,7 +11496,7 @@
                 <w:sz w:val="20"/>
                 <w:szCs w:val="20"/>
               </w:rPr>
-              <w:t>: calcula ambos ELO con los valores previos.</w:t>
+              <w:t>: empieza el jugador de mayor ELO.</w:t>
             </w:r>
             <w:hyperlink r:id="rId70">
               <w:r>
@@ -11750,13 +11515,13 @@
                   <w:szCs w:val="20"/>
                   <w:u w:val="single"/>
                 </w:rPr>
-                <w:t>bb9fe47</w:t>
+                <w:t>93da606</w:t>
               </w:r>
             </w:hyperlink>
             <w:sdt>
               <w:sdtPr>
-                <w:tag w:val="goog_rdk_6"/>
-                <w:id w:val="-1836794434"/>
+                <w:tag w:val="goog_rdk_4"/>
+                <w:id w:val="-1692427899"/>
               </w:sdtPr>
               <w:sdtEndPr/>
               <w:sdtContent>
@@ -11787,7 +11552,7 @@
                   <w:szCs w:val="20"/>
                   <w:u w:val="single"/>
                 </w:rPr>
-                <w:t>5b57213</w:t>
+                <w:t>14849c3</w:t>
               </w:r>
             </w:hyperlink>
             <w:r>
@@ -11795,17 +11560,116 @@
                 <w:sz w:val="20"/>
                 <w:szCs w:val="20"/>
               </w:rPr>
-              <w:t>: piso de 100.</w:t>
-            </w:r>
+              <w:t>: registra el lanzamiento y alterna el turno.</w:t>
+            </w:r>
+          </w:p>
+        </w:tc>
+        <w:tc>
+          <w:tcPr>
+            <w:tcW w:w="3242" w:type="dxa"/>
+            <w:tcBorders>
+              <w:top w:val="single" w:sz="5" w:space="0" w:color="000000"/>
+              <w:left w:val="single" w:sz="5" w:space="0" w:color="000000"/>
+              <w:bottom w:val="single" w:sz="5" w:space="0" w:color="000000"/>
+              <w:right w:val="single" w:sz="5" w:space="0" w:color="000000"/>
+            </w:tcBorders>
+            <w:tcMar>
+              <w:top w:w="100" w:type="dxa"/>
+              <w:left w:w="100" w:type="dxa"/>
+              <w:bottom w:w="100" w:type="dxa"/>
+              <w:right w:w="100" w:type="dxa"/>
+            </w:tcMar>
+          </w:tcPr>
+          <w:p>
+            <w:pPr>
+              <w:spacing w:before="40" w:after="40" w:line="276" w:lineRule="auto"/>
+              <w:rPr>
+                <w:sz w:val="20"/>
+                <w:szCs w:val="20"/>
+              </w:rPr>
+            </w:pPr>
             <w:hyperlink r:id="rId74">
               <w:r>
                 <w:rPr>
+                  <w:color w:val="1155CC"/>
                   <w:sz w:val="20"/>
                   <w:szCs w:val="20"/>
+                  <w:u w:val="single"/>
                 </w:rPr>
-                <w:t xml:space="preserve"> </w:t>
+                <w:t>b452842</w:t>
               </w:r>
             </w:hyperlink>
+            <w:r>
+              <w:rPr>
+                <w:sz w:val="20"/>
+                <w:szCs w:val="20"/>
+              </w:rPr>
+              <w:t>: separa la validación del registro del lanzamiento.</w:t>
+            </w:r>
+          </w:p>
+        </w:tc>
+      </w:tr>
+      <w:tr>
+        <w:trPr>
+          <w:trHeight w:val="1010"/>
+        </w:trPr>
+        <w:tc>
+          <w:tcPr>
+            <w:tcW w:w="1609" w:type="dxa"/>
+            <w:tcBorders>
+              <w:top w:val="single" w:sz="5" w:space="0" w:color="000000"/>
+              <w:left w:val="single" w:sz="5" w:space="0" w:color="000000"/>
+              <w:bottom w:val="single" w:sz="5" w:space="0" w:color="000000"/>
+              <w:right w:val="single" w:sz="5" w:space="0" w:color="000000"/>
+            </w:tcBorders>
+            <w:tcMar>
+              <w:top w:w="100" w:type="dxa"/>
+              <w:left w:w="100" w:type="dxa"/>
+              <w:bottom w:w="100" w:type="dxa"/>
+              <w:right w:w="100" w:type="dxa"/>
+            </w:tcMar>
+          </w:tcPr>
+          <w:p>
+            <w:pPr>
+              <w:spacing w:before="40" w:after="40" w:line="276" w:lineRule="auto"/>
+              <w:rPr>
+                <w:sz w:val="20"/>
+                <w:szCs w:val="20"/>
+              </w:rPr>
+            </w:pPr>
+            <w:r>
+              <w:rPr>
+                <w:sz w:val="20"/>
+                <w:szCs w:val="20"/>
+              </w:rPr>
+              <w:t>Fallar una batalla y ELO</w:t>
+            </w:r>
+          </w:p>
+        </w:tc>
+        <w:tc>
+          <w:tcPr>
+            <w:tcW w:w="4202" w:type="dxa"/>
+            <w:tcBorders>
+              <w:top w:val="single" w:sz="5" w:space="0" w:color="000000"/>
+              <w:left w:val="single" w:sz="5" w:space="0" w:color="000000"/>
+              <w:bottom w:val="single" w:sz="5" w:space="0" w:color="000000"/>
+              <w:right w:val="single" w:sz="5" w:space="0" w:color="000000"/>
+            </w:tcBorders>
+            <w:tcMar>
+              <w:top w:w="100" w:type="dxa"/>
+              <w:left w:w="100" w:type="dxa"/>
+              <w:bottom w:w="100" w:type="dxa"/>
+              <w:right w:w="100" w:type="dxa"/>
+            </w:tcMar>
+          </w:tcPr>
+          <w:p>
+            <w:pPr>
+              <w:spacing w:before="40" w:after="40" w:line="276" w:lineRule="auto"/>
+              <w:rPr>
+                <w:sz w:val="20"/>
+                <w:szCs w:val="20"/>
+              </w:rPr>
+            </w:pPr>
             <w:hyperlink r:id="rId75">
               <w:r>
                 <w:rPr>
@@ -11814,13 +11678,13 @@
                   <w:szCs w:val="20"/>
                   <w:u w:val="single"/>
                 </w:rPr>
-                <w:t>f374c54</w:t>
+                <w:t>01ea0b6</w:t>
               </w:r>
             </w:hyperlink>
             <w:sdt>
               <w:sdtPr>
-                <w:tag w:val="goog_rdk_7"/>
-                <w:id w:val="983192048"/>
+                <w:tag w:val="goog_rdk_5"/>
+                <w:id w:val="-1412520672"/>
               </w:sdtPr>
               <w:sdtEndPr/>
               <w:sdtContent>
@@ -11851,7 +11715,7 @@
                   <w:szCs w:val="20"/>
                   <w:u w:val="single"/>
                 </w:rPr>
-                <w:t>05c5305</w:t>
+                <w:t>f7e4668</w:t>
               </w:r>
             </w:hyperlink>
             <w:r>
@@ -11859,53 +11723,9 @@
                 <w:sz w:val="20"/>
                 <w:szCs w:val="20"/>
               </w:rPr>
-              <w:t>: exige rol organizador.</w:t>
-            </w:r>
-          </w:p>
-        </w:tc>
-        <w:tc>
-          <w:tcPr>
-            <w:tcW w:w="3242" w:type="dxa"/>
-            <w:tcBorders>
-              <w:top w:val="single" w:sz="5" w:space="0" w:color="000000"/>
-              <w:left w:val="single" w:sz="5" w:space="0" w:color="000000"/>
-              <w:bottom w:val="single" w:sz="5" w:space="0" w:color="000000"/>
-              <w:right w:val="single" w:sz="5" w:space="0" w:color="000000"/>
-            </w:tcBorders>
-            <w:tcMar>
-              <w:top w:w="100" w:type="dxa"/>
-              <w:left w:w="100" w:type="dxa"/>
-              <w:bottom w:w="100" w:type="dxa"/>
-              <w:right w:w="100" w:type="dxa"/>
-            </w:tcMar>
-          </w:tcPr>
-          <w:p>
-            <w:pPr>
-              <w:spacing w:before="40" w:after="40" w:line="276" w:lineRule="auto"/>
-              <w:rPr>
-                <w:sz w:val="20"/>
-                <w:szCs w:val="20"/>
-              </w:rPr>
-            </w:pPr>
+              <w:t>: calcula ambos ELO con los valores previos.</w:t>
+            </w:r>
             <w:hyperlink r:id="rId78">
-              <w:r>
-                <w:rPr>
-                  <w:color w:val="1155CC"/>
-                  <w:sz w:val="20"/>
-                  <w:szCs w:val="20"/>
-                  <w:u w:val="single"/>
-                </w:rPr>
-                <w:t>71e0559</w:t>
-              </w:r>
-            </w:hyperlink>
-            <w:r>
-              <w:rPr>
-                <w:sz w:val="20"/>
-                <w:szCs w:val="20"/>
-              </w:rPr>
-              <w:t>: extrae el cálculo del ELO de un jugador.</w:t>
-            </w:r>
-            <w:hyperlink r:id="rId79">
               <w:r>
                 <w:rPr>
                   <w:sz w:val="20"/>
@@ -11914,7 +11734,7 @@
                 <w:t xml:space="preserve"> </w:t>
               </w:r>
             </w:hyperlink>
-            <w:hyperlink r:id="rId80">
+            <w:hyperlink r:id="rId79">
               <w:r>
                 <w:rPr>
                   <w:color w:val="1155CC"/>
@@ -11922,95 +11742,13 @@
                   <w:szCs w:val="20"/>
                   <w:u w:val="single"/>
                 </w:rPr>
-                <w:t>04c3eb8</w:t>
-              </w:r>
-            </w:hyperlink>
-            <w:r>
-              <w:rPr>
-                <w:sz w:val="20"/>
-                <w:szCs w:val="20"/>
-              </w:rPr>
-              <w:t>: un test por efecto del fallo.</w:t>
-            </w:r>
-          </w:p>
-        </w:tc>
-      </w:tr>
-      <w:tr>
-        <w:trPr>
-          <w:trHeight w:val="1010"/>
-        </w:trPr>
-        <w:tc>
-          <w:tcPr>
-            <w:tcW w:w="1609" w:type="dxa"/>
-            <w:tcBorders>
-              <w:top w:val="single" w:sz="5" w:space="0" w:color="000000"/>
-              <w:left w:val="single" w:sz="5" w:space="0" w:color="000000"/>
-              <w:bottom w:val="single" w:sz="5" w:space="0" w:color="000000"/>
-              <w:right w:val="single" w:sz="5" w:space="0" w:color="000000"/>
-            </w:tcBorders>
-            <w:tcMar>
-              <w:top w:w="100" w:type="dxa"/>
-              <w:left w:w="100" w:type="dxa"/>
-              <w:bottom w:w="100" w:type="dxa"/>
-              <w:right w:w="100" w:type="dxa"/>
-            </w:tcMar>
-          </w:tcPr>
-          <w:p>
-            <w:pPr>
-              <w:spacing w:before="40" w:after="40" w:line="276" w:lineRule="auto"/>
-              <w:rPr>
-                <w:sz w:val="20"/>
-                <w:szCs w:val="20"/>
-              </w:rPr>
-            </w:pPr>
-            <w:r>
-              <w:rPr>
-                <w:sz w:val="20"/>
-                <w:szCs w:val="20"/>
-              </w:rPr>
-              <w:t>Generar rondas</w:t>
-            </w:r>
-          </w:p>
-        </w:tc>
-        <w:tc>
-          <w:tcPr>
-            <w:tcW w:w="4202" w:type="dxa"/>
-            <w:tcBorders>
-              <w:top w:val="single" w:sz="5" w:space="0" w:color="000000"/>
-              <w:left w:val="single" w:sz="5" w:space="0" w:color="000000"/>
-              <w:bottom w:val="single" w:sz="5" w:space="0" w:color="000000"/>
-              <w:right w:val="single" w:sz="5" w:space="0" w:color="000000"/>
-            </w:tcBorders>
-            <w:tcMar>
-              <w:top w:w="100" w:type="dxa"/>
-              <w:left w:w="100" w:type="dxa"/>
-              <w:bottom w:w="100" w:type="dxa"/>
-              <w:right w:w="100" w:type="dxa"/>
-            </w:tcMar>
-          </w:tcPr>
-          <w:p>
-            <w:pPr>
-              <w:spacing w:before="40" w:after="40" w:line="276" w:lineRule="auto"/>
-              <w:rPr>
-                <w:sz w:val="20"/>
-                <w:szCs w:val="20"/>
-              </w:rPr>
-            </w:pPr>
-            <w:hyperlink r:id="rId81">
-              <w:r>
-                <w:rPr>
-                  <w:color w:val="1155CC"/>
-                  <w:sz w:val="20"/>
-                  <w:szCs w:val="20"/>
-                  <w:u w:val="single"/>
-                </w:rPr>
-                <w:t>f31f35f</w:t>
+                <w:t>bb9fe47</w:t>
               </w:r>
             </w:hyperlink>
             <w:sdt>
               <w:sdtPr>
-                <w:tag w:val="goog_rdk_8"/>
-                <w:id w:val="-663966452"/>
+                <w:tag w:val="goog_rdk_6"/>
+                <w:id w:val="-1836794434"/>
               </w:sdtPr>
               <w:sdtEndPr/>
               <w:sdtContent>
@@ -12024,6 +11762,33 @@
                 </w:r>
               </w:sdtContent>
             </w:sdt>
+            <w:hyperlink r:id="rId80">
+              <w:r>
+                <w:rPr>
+                  <w:sz w:val="20"/>
+                  <w:szCs w:val="20"/>
+                </w:rPr>
+                <w:t xml:space="preserve"> </w:t>
+              </w:r>
+            </w:hyperlink>
+            <w:hyperlink r:id="rId81">
+              <w:r>
+                <w:rPr>
+                  <w:color w:val="1155CC"/>
+                  <w:sz w:val="20"/>
+                  <w:szCs w:val="20"/>
+                  <w:u w:val="single"/>
+                </w:rPr>
+                <w:t>5b57213</w:t>
+              </w:r>
+            </w:hyperlink>
+            <w:r>
+              <w:rPr>
+                <w:sz w:val="20"/>
+                <w:szCs w:val="20"/>
+              </w:rPr>
+              <w:t>: piso de 100.</w:t>
+            </w:r>
             <w:hyperlink r:id="rId82">
               <w:r>
                 <w:rPr>
@@ -12041,16 +11806,26 @@
                   <w:szCs w:val="20"/>
                   <w:u w:val="single"/>
                 </w:rPr>
-                <w:t>0424654</w:t>
+                <w:t>f374c54</w:t>
               </w:r>
             </w:hyperlink>
-            <w:r>
-              <w:rPr>
-                <w:sz w:val="20"/>
-                <w:szCs w:val="20"/>
-              </w:rPr>
-              <w:t>: desempate determinístico por id.</w:t>
-            </w:r>
+            <w:sdt>
+              <w:sdtPr>
+                <w:tag w:val="goog_rdk_7"/>
+                <w:id w:val="983192048"/>
+              </w:sdtPr>
+              <w:sdtEndPr/>
+              <w:sdtContent>
+                <w:r>
+                  <w:rPr>
+                    <w:rFonts w:ascii="Cardo" w:eastAsia="Cardo" w:hAnsi="Cardo" w:cs="Cardo"/>
+                    <w:sz w:val="20"/>
+                    <w:szCs w:val="20"/>
+                  </w:rPr>
+                  <w:t xml:space="preserve"> →</w:t>
+                </w:r>
+              </w:sdtContent>
+            </w:sdt>
             <w:hyperlink r:id="rId84">
               <w:r>
                 <w:rPr>
@@ -12068,27 +11843,61 @@
                   <w:szCs w:val="20"/>
                   <w:u w:val="single"/>
                 </w:rPr>
-                <w:t>8f553df</w:t>
+                <w:t>05c5305</w:t>
               </w:r>
             </w:hyperlink>
-            <w:sdt>
-              <w:sdtPr>
-                <w:tag w:val="goog_rdk_9"/>
-                <w:id w:val="2105861676"/>
-              </w:sdtPr>
-              <w:sdtEndPr/>
-              <w:sdtContent>
-                <w:r>
-                  <w:rPr>
-                    <w:rFonts w:ascii="Cardo" w:eastAsia="Cardo" w:hAnsi="Cardo" w:cs="Cardo"/>
-                    <w:sz w:val="20"/>
-                    <w:szCs w:val="20"/>
-                  </w:rPr>
-                  <w:t xml:space="preserve"> →</w:t>
-                </w:r>
-              </w:sdtContent>
-            </w:sdt>
+            <w:r>
+              <w:rPr>
+                <w:sz w:val="20"/>
+                <w:szCs w:val="20"/>
+              </w:rPr>
+              <w:t>: exige rol organizador.</w:t>
+            </w:r>
+          </w:p>
+        </w:tc>
+        <w:tc>
+          <w:tcPr>
+            <w:tcW w:w="3242" w:type="dxa"/>
+            <w:tcBorders>
+              <w:top w:val="single" w:sz="5" w:space="0" w:color="000000"/>
+              <w:left w:val="single" w:sz="5" w:space="0" w:color="000000"/>
+              <w:bottom w:val="single" w:sz="5" w:space="0" w:color="000000"/>
+              <w:right w:val="single" w:sz="5" w:space="0" w:color="000000"/>
+            </w:tcBorders>
+            <w:tcMar>
+              <w:top w:w="100" w:type="dxa"/>
+              <w:left w:w="100" w:type="dxa"/>
+              <w:bottom w:w="100" w:type="dxa"/>
+              <w:right w:w="100" w:type="dxa"/>
+            </w:tcMar>
+          </w:tcPr>
+          <w:p>
+            <w:pPr>
+              <w:spacing w:before="40" w:after="40" w:line="276" w:lineRule="auto"/>
+              <w:rPr>
+                <w:sz w:val="20"/>
+                <w:szCs w:val="20"/>
+              </w:rPr>
+            </w:pPr>
             <w:hyperlink r:id="rId86">
+              <w:r>
+                <w:rPr>
+                  <w:color w:val="1155CC"/>
+                  <w:sz w:val="20"/>
+                  <w:szCs w:val="20"/>
+                  <w:u w:val="single"/>
+                </w:rPr>
+                <w:t>71e0559</w:t>
+              </w:r>
+            </w:hyperlink>
+            <w:r>
+              <w:rPr>
+                <w:sz w:val="20"/>
+                <w:szCs w:val="20"/>
+              </w:rPr>
+              <w:t>: extrae el cálculo del ELO de un jugador.</w:t>
+            </w:r>
+            <w:hyperlink r:id="rId87">
               <w:r>
                 <w:rPr>
                   <w:sz w:val="20"/>
@@ -12097,50 +11906,6 @@
                 <w:t xml:space="preserve"> </w:t>
               </w:r>
             </w:hyperlink>
-            <w:hyperlink r:id="rId87">
-              <w:r>
-                <w:rPr>
-                  <w:color w:val="1155CC"/>
-                  <w:sz w:val="20"/>
-                  <w:szCs w:val="20"/>
-                  <w:u w:val="single"/>
-                </w:rPr>
-                <w:t>132bef3</w:t>
-              </w:r>
-            </w:hyperlink>
-            <w:r>
-              <w:rPr>
-                <w:sz w:val="20"/>
-                <w:szCs w:val="20"/>
-              </w:rPr>
-              <w:t>: la primera ronda pasa el torneo a En curso.</w:t>
-            </w:r>
-          </w:p>
-        </w:tc>
-        <w:tc>
-          <w:tcPr>
-            <w:tcW w:w="3242" w:type="dxa"/>
-            <w:tcBorders>
-              <w:top w:val="single" w:sz="5" w:space="0" w:color="000000"/>
-              <w:left w:val="single" w:sz="5" w:space="0" w:color="000000"/>
-              <w:bottom w:val="single" w:sz="5" w:space="0" w:color="000000"/>
-              <w:right w:val="single" w:sz="5" w:space="0" w:color="000000"/>
-            </w:tcBorders>
-            <w:tcMar>
-              <w:top w:w="100" w:type="dxa"/>
-              <w:left w:w="100" w:type="dxa"/>
-              <w:bottom w:w="100" w:type="dxa"/>
-              <w:right w:w="100" w:type="dxa"/>
-            </w:tcMar>
-          </w:tcPr>
-          <w:p>
-            <w:pPr>
-              <w:spacing w:before="40" w:after="40" w:line="276" w:lineRule="auto"/>
-              <w:rPr>
-                <w:sz w:val="20"/>
-                <w:szCs w:val="20"/>
-              </w:rPr>
-            </w:pPr>
             <w:hyperlink r:id="rId88">
               <w:r>
                 <w:rPr>
@@ -12149,7 +11914,7 @@
                   <w:szCs w:val="20"/>
                   <w:u w:val="single"/>
                 </w:rPr>
-                <w:t>323ff9d</w:t>
+                <w:t>04c3eb8</w:t>
               </w:r>
             </w:hyperlink>
             <w:r>
@@ -12157,7 +11922,7 @@
                 <w:sz w:val="20"/>
                 <w:szCs w:val="20"/>
               </w:rPr>
-              <w:t>: separa la primera ronda de las siguientes.</w:t>
+              <w:t>: un test por efecto del fallo.</w:t>
             </w:r>
           </w:p>
         </w:tc>
@@ -12195,7 +11960,7 @@
                 <w:sz w:val="20"/>
                 <w:szCs w:val="20"/>
               </w:rPr>
-              <w:t>Finalizar el torneo</w:t>
+              <w:t>Generar rondas</w:t>
             </w:r>
           </w:p>
         </w:tc>
@@ -12231,13 +11996,13 @@
                   <w:szCs w:val="20"/>
                   <w:u w:val="single"/>
                 </w:rPr>
-                <w:t>44e8779</w:t>
+                <w:t>f31f35f</w:t>
               </w:r>
             </w:hyperlink>
             <w:sdt>
               <w:sdtPr>
-                <w:tag w:val="goog_rdk_10"/>
-                <w:id w:val="-1999080511"/>
+                <w:tag w:val="goog_rdk_8"/>
+                <w:id w:val="-663966452"/>
               </w:sdtPr>
               <w:sdtEndPr/>
               <w:sdtContent>
@@ -12268,7 +12033,7 @@
                   <w:szCs w:val="20"/>
                   <w:u w:val="single"/>
                 </w:rPr>
-                <w:t>85f137f</w:t>
+                <w:t>0424654</w:t>
               </w:r>
             </w:hyperlink>
             <w:r>
@@ -12276,7 +12041,7 @@
                 <w:sz w:val="20"/>
                 <w:szCs w:val="20"/>
               </w:rPr>
-              <w:t>: devuelve al campeón.</w:t>
+              <w:t>: desempate determinístico por id.</w:t>
             </w:r>
             <w:hyperlink r:id="rId92">
               <w:r>
@@ -12295,13 +12060,13 @@
                   <w:szCs w:val="20"/>
                   <w:u w:val="single"/>
                 </w:rPr>
-                <w:t>29e0c0e</w:t>
+                <w:t>8f553df</w:t>
               </w:r>
             </w:hyperlink>
             <w:sdt>
               <w:sdtPr>
-                <w:tag w:val="goog_rdk_11"/>
-                <w:id w:val="1709007232"/>
+                <w:tag w:val="goog_rdk_9"/>
+                <w:id w:val="2105861676"/>
               </w:sdtPr>
               <w:sdtEndPr/>
               <w:sdtContent>
@@ -12332,6 +12097,233 @@
                   <w:szCs w:val="20"/>
                   <w:u w:val="single"/>
                 </w:rPr>
+                <w:t>132bef3</w:t>
+              </w:r>
+            </w:hyperlink>
+            <w:r>
+              <w:rPr>
+                <w:sz w:val="20"/>
+                <w:szCs w:val="20"/>
+              </w:rPr>
+              <w:t>: la primera ronda pasa el torneo a En curso.</w:t>
+            </w:r>
+          </w:p>
+        </w:tc>
+        <w:tc>
+          <w:tcPr>
+            <w:tcW w:w="3242" w:type="dxa"/>
+            <w:tcBorders>
+              <w:top w:val="single" w:sz="5" w:space="0" w:color="000000"/>
+              <w:left w:val="single" w:sz="5" w:space="0" w:color="000000"/>
+              <w:bottom w:val="single" w:sz="5" w:space="0" w:color="000000"/>
+              <w:right w:val="single" w:sz="5" w:space="0" w:color="000000"/>
+            </w:tcBorders>
+            <w:tcMar>
+              <w:top w:w="100" w:type="dxa"/>
+              <w:left w:w="100" w:type="dxa"/>
+              <w:bottom w:w="100" w:type="dxa"/>
+              <w:right w:w="100" w:type="dxa"/>
+            </w:tcMar>
+          </w:tcPr>
+          <w:p>
+            <w:pPr>
+              <w:spacing w:before="40" w:after="40" w:line="276" w:lineRule="auto"/>
+              <w:rPr>
+                <w:sz w:val="20"/>
+                <w:szCs w:val="20"/>
+              </w:rPr>
+            </w:pPr>
+            <w:hyperlink r:id="rId96">
+              <w:r>
+                <w:rPr>
+                  <w:color w:val="1155CC"/>
+                  <w:sz w:val="20"/>
+                  <w:szCs w:val="20"/>
+                  <w:u w:val="single"/>
+                </w:rPr>
+                <w:t>323ff9d</w:t>
+              </w:r>
+            </w:hyperlink>
+            <w:r>
+              <w:rPr>
+                <w:sz w:val="20"/>
+                <w:szCs w:val="20"/>
+              </w:rPr>
+              <w:t>: separa la primera ronda de las siguientes.</w:t>
+            </w:r>
+          </w:p>
+        </w:tc>
+      </w:tr>
+      <w:tr>
+        <w:trPr>
+          <w:trHeight w:val="1010"/>
+        </w:trPr>
+        <w:tc>
+          <w:tcPr>
+            <w:tcW w:w="1609" w:type="dxa"/>
+            <w:tcBorders>
+              <w:top w:val="single" w:sz="5" w:space="0" w:color="000000"/>
+              <w:left w:val="single" w:sz="5" w:space="0" w:color="000000"/>
+              <w:bottom w:val="single" w:sz="5" w:space="0" w:color="000000"/>
+              <w:right w:val="single" w:sz="5" w:space="0" w:color="000000"/>
+            </w:tcBorders>
+            <w:tcMar>
+              <w:top w:w="100" w:type="dxa"/>
+              <w:left w:w="100" w:type="dxa"/>
+              <w:bottom w:w="100" w:type="dxa"/>
+              <w:right w:w="100" w:type="dxa"/>
+            </w:tcMar>
+          </w:tcPr>
+          <w:p>
+            <w:pPr>
+              <w:spacing w:before="40" w:after="40" w:line="276" w:lineRule="auto"/>
+              <w:rPr>
+                <w:sz w:val="20"/>
+                <w:szCs w:val="20"/>
+              </w:rPr>
+            </w:pPr>
+            <w:r>
+              <w:rPr>
+                <w:sz w:val="20"/>
+                <w:szCs w:val="20"/>
+              </w:rPr>
+              <w:t>Finalizar el torneo</w:t>
+            </w:r>
+          </w:p>
+        </w:tc>
+        <w:tc>
+          <w:tcPr>
+            <w:tcW w:w="4202" w:type="dxa"/>
+            <w:tcBorders>
+              <w:top w:val="single" w:sz="5" w:space="0" w:color="000000"/>
+              <w:left w:val="single" w:sz="5" w:space="0" w:color="000000"/>
+              <w:bottom w:val="single" w:sz="5" w:space="0" w:color="000000"/>
+              <w:right w:val="single" w:sz="5" w:space="0" w:color="000000"/>
+            </w:tcBorders>
+            <w:tcMar>
+              <w:top w:w="100" w:type="dxa"/>
+              <w:left w:w="100" w:type="dxa"/>
+              <w:bottom w:w="100" w:type="dxa"/>
+              <w:right w:w="100" w:type="dxa"/>
+            </w:tcMar>
+          </w:tcPr>
+          <w:p>
+            <w:pPr>
+              <w:spacing w:before="40" w:after="40" w:line="276" w:lineRule="auto"/>
+              <w:rPr>
+                <w:sz w:val="20"/>
+                <w:szCs w:val="20"/>
+              </w:rPr>
+            </w:pPr>
+            <w:hyperlink r:id="rId97">
+              <w:r>
+                <w:rPr>
+                  <w:color w:val="1155CC"/>
+                  <w:sz w:val="20"/>
+                  <w:szCs w:val="20"/>
+                  <w:u w:val="single"/>
+                </w:rPr>
+                <w:t>44e8779</w:t>
+              </w:r>
+            </w:hyperlink>
+            <w:sdt>
+              <w:sdtPr>
+                <w:tag w:val="goog_rdk_10"/>
+                <w:id w:val="-1999080511"/>
+              </w:sdtPr>
+              <w:sdtEndPr/>
+              <w:sdtContent>
+                <w:r>
+                  <w:rPr>
+                    <w:rFonts w:ascii="Cardo" w:eastAsia="Cardo" w:hAnsi="Cardo" w:cs="Cardo"/>
+                    <w:sz w:val="20"/>
+                    <w:szCs w:val="20"/>
+                  </w:rPr>
+                  <w:t xml:space="preserve"> →</w:t>
+                </w:r>
+              </w:sdtContent>
+            </w:sdt>
+            <w:hyperlink r:id="rId98">
+              <w:r>
+                <w:rPr>
+                  <w:sz w:val="20"/>
+                  <w:szCs w:val="20"/>
+                </w:rPr>
+                <w:t xml:space="preserve"> </w:t>
+              </w:r>
+            </w:hyperlink>
+            <w:hyperlink r:id="rId99">
+              <w:r>
+                <w:rPr>
+                  <w:color w:val="1155CC"/>
+                  <w:sz w:val="20"/>
+                  <w:szCs w:val="20"/>
+                  <w:u w:val="single"/>
+                </w:rPr>
+                <w:t>85f137f</w:t>
+              </w:r>
+            </w:hyperlink>
+            <w:r>
+              <w:rPr>
+                <w:sz w:val="20"/>
+                <w:szCs w:val="20"/>
+              </w:rPr>
+              <w:t>: devuelve al campeón.</w:t>
+            </w:r>
+            <w:hyperlink r:id="rId100">
+              <w:r>
+                <w:rPr>
+                  <w:sz w:val="20"/>
+                  <w:szCs w:val="20"/>
+                </w:rPr>
+                <w:t xml:space="preserve"> </w:t>
+              </w:r>
+            </w:hyperlink>
+            <w:hyperlink r:id="rId101">
+              <w:r>
+                <w:rPr>
+                  <w:color w:val="1155CC"/>
+                  <w:sz w:val="20"/>
+                  <w:szCs w:val="20"/>
+                  <w:u w:val="single"/>
+                </w:rPr>
+                <w:t>29e0c0e</w:t>
+              </w:r>
+            </w:hyperlink>
+            <w:sdt>
+              <w:sdtPr>
+                <w:tag w:val="goog_rdk_11"/>
+                <w:id w:val="1709007232"/>
+              </w:sdtPr>
+              <w:sdtEndPr/>
+              <w:sdtContent>
+                <w:r>
+                  <w:rPr>
+                    <w:rFonts w:ascii="Cardo" w:eastAsia="Cardo" w:hAnsi="Cardo" w:cs="Cardo"/>
+                    <w:sz w:val="20"/>
+                    <w:szCs w:val="20"/>
+                  </w:rPr>
+                  <w:t xml:space="preserve"> →</w:t>
+                </w:r>
+              </w:sdtContent>
+            </w:sdt>
+            <w:hyperlink r:id="rId102">
+              <w:r>
+                <w:rPr>
+                  <w:sz w:val="20"/>
+                  <w:szCs w:val="20"/>
+                </w:rPr>
+                <w:t xml:space="preserve"> </w:t>
+              </w:r>
+            </w:hyperlink>
+            <w:hyperlink r:id="rId103">
+              <w:r>
+                <w:rPr>
+                  <w:color w:val="1155CC"/>
+                  <w:sz w:val="20"/>
+                  <w:szCs w:val="20"/>
+                  <w:u w:val="single"/>
+                </w:rPr>
                 <w:t>2b04d28</w:t>
               </w:r>
             </w:hyperlink>
@@ -12368,7 +12360,7 @@
                 <w:szCs w:val="20"/>
               </w:rPr>
             </w:pPr>
-            <w:hyperlink r:id="rId96">
+            <w:hyperlink r:id="rId104">
               <w:r>
                 <w:rPr>
                   <w:color w:val="1155CC"/>
@@ -12414,7 +12406,7 @@
     </w:p>
     <w:p>
       <w:r>
-        <w:t>La Ilustración 9 muestra la salida de coverlet sin exclusiones: 42,72 % de líneas (3.041 de 7.117), 99,45 % de ramas (543 de 546) y 94,58 % de métodos.</w:t>
+        <w:t>La Ilustración 8 muestra la salida de coverlet en local sin exclusiones: 42,72 % de líneas (3.041 de 7.117), 99,45 % de ramas (543 de 546) y 94,58 % de métodos.</w:t>
       </w:r>
     </w:p>
     <w:p>
@@ -12439,7 +12431,7 @@
                     <pic:cNvPicPr preferRelativeResize="0"/>
                   </pic:nvPicPr>
                   <pic:blipFill>
-                    <a:blip r:embed="rId97"/>
+                    <a:blip r:embed="rId105"/>
                     <a:srcRect/>
                     <a:stretch>
                       <a:fillRect/>
@@ -12476,18 +12468,12 @@
           <w:sz w:val="20"/>
           <w:szCs w:val="20"/>
         </w:rPr>
-        <w:t>Ilustración 9. Salida de coverlet sin exclusiones</w:t>
-      </w:r>
-    </w:p>
-    <w:p>
-      <w:r>
-        <w:t xml:space="preserve">No llega al 100 % por los tres elementos de la </w:t>
-      </w:r>
-      <w:r>
-        <w:t>Tabla 8</w:t>
-      </w:r>
-      <w:r>
-        <w:t>, ninguno con una regla de negocio que probar.</w:t>
+        <w:t>Ilustración 8. Salida de coverlet sin exclusiones</w:t>
+      </w:r>
+    </w:p>
+    <w:p>
+      <w:r>
+        <w:t>No llega al 100 % por los tres elementos de la Tabla 8, ninguno con una regla de negocio que probar.</w:t>
       </w:r>
     </w:p>
     <w:p>
@@ -12504,14 +12490,7 @@
           <w:sz w:val="20"/>
           <w:szCs w:val="20"/>
         </w:rPr>
-        <w:t>Tabla 8</w:t>
-      </w:r>
-      <w:r>
-        <w:rPr>
-          <w:sz w:val="20"/>
-          <w:szCs w:val="20"/>
-        </w:rPr>
-        <w:t>. Elementos no cubiertos en la medición sin exclusiones</w:t>
+        <w:t>Tabla 8. Elementos no cubiertos en la medición sin exclusiones</w:t>
       </w:r>
     </w:p>
     <w:tbl>
@@ -13013,10 +12992,7 @@
     </w:p>
     <w:p>
       <w:r>
-        <w:t>Los nombres están en el lenguaje del dominio de la letra (Inscripcion, Batalla, Lanzamiento, EstadoTorneo.Abierto), así que una regla del código se compara con la letra sin traducir. Dicen la intención: ObtenerTorneoExistente deja claro que lanza si no existe, EstaVigente encapsula "aceptada en un torneo que no terminó" y cada excepción nombra la regla que se incumplió (TorneoNoAbiertoException, TurnoIncorrectoException). Los números de la letra son constantes con nombre (K, EloMinimo, LanzamientosPorJugado</w:t>
-      </w:r>
-      <w:r>
-        <w:t>r) y los tests siguen el formato Metodo_Escenario_Resultado.</w:t>
+        <w:t>Los nombres están en el lenguaje del dominio de la letra (Inscripcion, Batalla, Lanzamiento, EstadoTorneo.Abierto), así que una regla del código se compara con la letra sin traducir. Dicen la intención: ObtenerTorneoExistente deja claro que lanza si no existe, EstaVigente encapsula "aceptada en un torneo que no terminó" y cada excepción nombra la regla que se incumplió (TorneoNoAbiertoException, TurnoIncorrectoException). Los números de la letra son constantes con nombre (K, EloMinimo, BaseLogistica, FactorDeEscala, LanzamientosPorJugador) y los tests siguen el formato Metodo_Escenario_Resultado.</w:t>
       </w:r>
     </w:p>
     <w:p>
@@ -13049,7 +13025,7 @@
       <w:r>
         <w:t>Los comentarios explican el porqué y no repiten el código; por ejemplo, en ServicioInscripciones: "El estado va primero, como en la letra (1.5): un torneo En curso tiene el cupo lleno, pero el motivo del rechazo es que ya no admite inscripciones". La auditoría (D-68) quitó los comentarios que no aportaban, como marcas de autoría o referencias a reviews ya resueltos (</w:t>
       </w:r>
-      <w:hyperlink r:id="rId98">
+      <w:hyperlink r:id="rId106">
         <w:r>
           <w:rPr>
             <w:color w:val="1155CC"/>
@@ -13085,10 +13061,7 @@
     </w:p>
     <w:p>
       <w:r>
-        <w:t>Las entidades esconden sus datos y exponen comportamiento: las propiedades tienen private set y el estado cambia solo con métodos que validan la regla (Inscripcion.Cancelar, Batalla.Lanzar); la lista de lanzamientos se expone como IReadOnlyCollection. Los DTOs son estructuras de datos sin comportamiento y la API nunca expone entidades. Los errores se informan con excepciones, y un único filtro global, FiltroExcepciones, las traduce a código de estado y errorCode, así que ningún controller tiene try/catch; u</w:t>
-      </w:r>
-      <w:r>
-        <w:t>n error no previsto devuelve 500 con un mensaje fijo. El código de terceros queda en los bordes: EF Core vive solo en Repositorios, detrás de IRepositorios; el reloj y el azar entran por TimeProvider e ISorteo, y la composición se resuelve en FarmeORT.Fabrica (D-34).</w:t>
+        <w:t>Las entidades esconden sus datos y exponen comportamiento: las propiedades tienen private set y el estado cambia solo con métodos que validan la regla (Inscripcion.Cancelar, Batalla.Lanzar); la lista de lanzamientos se expone como IReadOnlyCollection. Los DTOs son estructuras de datos sin comportamiento y la API nunca expone entidades. Los errores se informan con excepciones, y un único filtro global, FiltroExcepciones, las traduce a código de estado y errorCode, así que ningún controller tiene try/catch; un error no previsto devuelve 500 con un mensaje fijo. El código de terceros queda en los bordes: EF Core vive solo en Repositorios, detrás de IRepositorios; el reloj y el azar entran por TimeProvider e ISorteo, y la composición se resuelve en FarmeORT.Fabrica (D-34).</w:t>
       </w:r>
     </w:p>
     <w:p>
@@ -13114,10 +13087,7 @@
     </w:p>
     <w:p>
       <w:r>
-        <w:t>Las pruebas son rápidas (los 1.046 tests corren en segundos), independientes, repetibles, auto-validadas y escritas antes del código, y cada una prueba un concepto. Las clases son chicas y tienen una sola razón para cambiar: en lugar de un servicio de batallas grande hay uno por caso de uso (ServicioLanzamientos, ServicioFallos, ServicioRondas, ServicioFinalizaciones). Reciben interfaces por primary constructor, y servicios, repositorios y filtros son internal sealed, lo que reduce el acoplamiento. Las regl</w:t>
-      </w:r>
-      <w:r>
-        <w:t>as que la letra anticipa que pueden cambiar (otras fórmulas de ELO, otros emparejamientos) están detrás de una interfaz.</w:t>
+        <w:t>Las pruebas son rápidas (los 1.046 tests corren en segundos), independientes, repetibles, auto-validadas y escritas antes del código, y cada una prueba un concepto. Las clases son chicas y tienen una sola razón para cambiar: en lugar de un servicio de batallas grande hay uno por caso de uso (ServicioLanzamientos, ServicioFallos, ServicioRondas, ServicioFinalizaciones). Reciben interfaces por primary constructor, y servicios, repositorios y filtros son internal sealed, lo que reduce el acoplamiento. Las reglas que la letra anticipa que pueden cambiar (otras fórmulas de ELO, otros emparejamientos) están detrás de una interfaz.</w:t>
       </w:r>
     </w:p>
     <w:p>
@@ -13145,7 +13115,7 @@
       <w:r>
         <w:t>Los REFACTOR siguieron las reglas del diseño simple: quitaron duplicación (</w:t>
       </w:r>
-      <w:hyperlink r:id="rId99">
+      <w:hyperlink r:id="rId107">
         <w:r>
           <w:rPr>
             <w:color w:val="1155CC"/>
@@ -13157,12 +13127,12 @@
       <w:r>
         <w:t>,</w:t>
       </w:r>
-      <w:hyperlink r:id="rId100">
+      <w:hyperlink r:id="rId108">
         <w:r>
           <w:t xml:space="preserve"> </w:t>
         </w:r>
       </w:hyperlink>
-      <w:hyperlink r:id="rId101">
+      <w:hyperlink r:id="rId109">
         <w:r>
           <w:rPr>
             <w:color w:val="1155CC"/>
@@ -13174,12 +13144,12 @@
       <w:r>
         <w:t>,</w:t>
       </w:r>
-      <w:hyperlink r:id="rId102">
+      <w:hyperlink r:id="rId110">
         <w:r>
           <w:t xml:space="preserve"> </w:t>
         </w:r>
       </w:hyperlink>
-      <w:hyperlink r:id="rId103">
+      <w:hyperlink r:id="rId111">
         <w:r>
           <w:rPr>
             <w:color w:val="1155CC"/>
@@ -13215,8 +13185,8 @@
       </w:pPr>
     </w:p>
     <w:sectPr>
-      <w:footerReference w:type="default" r:id="rId104"/>
-      <w:footerReference w:type="first" r:id="rId105"/>
+      <w:footerReference w:type="default" r:id="rId112"/>
+      <w:footerReference w:type="first" r:id="rId113"/>
       <w:pgSz w:w="11920" w:h="16840"/>
       <w:pgMar w:top="1425" w:right="1425" w:bottom="1425" w:left="1425" w:header="720" w:footer="720" w:gutter="0"/>
       <w:pgNumType w:start="1"/>

</xml_diff>